<commit_message>
Match Markdown typography and use official image mirror for CI
</commit_message>
<xml_diff>
--- a/api/app/recursos/guia-workflow-ia.docx
+++ b/api/app/recursos/guia-workflow-ia.docx
@@ -7,7 +7,9 @@
         <w:pStyle w:val="Title"/>
       </w:pPr>
       <w:r>
-        <w:t>Guía simple para proponer un workflow de IA</w:t>
+        <w:t xml:space="preserve">Guía simple para proponer </w:t>
+        <w:br/>
+        <w:t>un workflow de IA</w:t>
       </w:r>
     </w:p>
     <w:p>
@@ -113,6 +115,9 @@
       </w:r>
     </w:p>
     <w:p>
+      <w:pPr>
+        <w:keepNext/>
+      </w:pPr>
       <w:r>
         <w:rPr>
           <w:b w:val="0"/>
@@ -304,7 +309,6 @@
     <w:p>
       <w:pPr>
         <w:pStyle w:val="Heading1"/>
-        <w:pageBreakBefore/>
       </w:pPr>
       <w:r>
         <w:t>4. Veamos cómo se hace esa parte</w:t>
@@ -331,6 +335,9 @@
       </w:r>
     </w:p>
     <w:p>
+      <w:pPr>
+        <w:keepNext/>
+      </w:pPr>
       <w:r>
         <w:rPr>
           <w:b w:val="0"/>
@@ -525,7 +532,6 @@
     <w:p>
       <w:pPr>
         <w:pStyle w:val="Heading2"/>
-        <w:pageBreakBefore/>
       </w:pPr>
       <w:r>
         <w:t>Fuentes de información y accesos por paso</w:t>
@@ -556,6 +562,14 @@
         <w:tblStyle w:val="TableGrid"/>
         <w:tblW w:type="auto" w:w="0"/>
         <w:tblLook w:firstColumn="1" w:firstRow="1" w:lastColumn="0" w:lastRow="0" w:noHBand="0" w:noVBand="1" w:val="04A0"/>
+        <w:tblBorders>
+          <w:top w:val="single" w:sz="4" w:color="DFE3E7"/>
+          <w:left w:val="single" w:sz="4" w:color="DFE3E7"/>
+          <w:bottom w:val="single" w:sz="4" w:color="DFE3E7"/>
+          <w:right w:val="single" w:sz="4" w:color="DFE3E7"/>
+          <w:insideH w:val="single" w:sz="4" w:color="DFE3E7"/>
+          <w:insideV w:val="single" w:sz="4" w:color="DFE3E7"/>
+        </w:tblBorders>
       </w:tblPr>
       <w:tblGrid>
         <w:gridCol w:w="3456"/>
@@ -570,7 +584,7 @@
         <w:tc>
           <w:tcPr>
             <w:tcW w:type="dxa" w:w="3456"/>
-            <w:shd w:fill="E8EDF2"/>
+            <w:shd w:fill="F5F6F7"/>
           </w:tcPr>
           <w:p>
             <w:pPr>
@@ -579,7 +593,7 @@
             <w:r>
               <w:rPr>
                 <w:b/>
-                <w:sz w:val="18"/>
+                <w:sz w:val="19"/>
               </w:rPr>
               <w:t>Paso del flujograma</w:t>
             </w:r>
@@ -588,7 +602,7 @@
         <w:tc>
           <w:tcPr>
             <w:tcW w:type="dxa" w:w="3456"/>
-            <w:shd w:fill="E8EDF2"/>
+            <w:shd w:fill="F5F6F7"/>
           </w:tcPr>
           <w:p>
             <w:pPr>
@@ -597,7 +611,7 @@
             <w:r>
               <w:rPr>
                 <w:b/>
-                <w:sz w:val="18"/>
+                <w:sz w:val="19"/>
               </w:rPr>
               <w:t>¿Qué información necesita y de dónde la obtiene?</w:t>
             </w:r>
@@ -606,7 +620,7 @@
         <w:tc>
           <w:tcPr>
             <w:tcW w:type="dxa" w:w="3456"/>
-            <w:shd w:fill="E8EDF2"/>
+            <w:shd w:fill="F5F6F7"/>
           </w:tcPr>
           <w:p>
             <w:pPr>
@@ -615,7 +629,7 @@
             <w:r>
               <w:rPr>
                 <w:b/>
-                <w:sz w:val="18"/>
+                <w:sz w:val="19"/>
               </w:rPr>
               <w:t>¿Dónde registra o envía el resultado?</w:t>
             </w:r>
@@ -637,7 +651,7 @@
             <w:r>
               <w:rPr>
                 <w:b w:val="0"/>
-                <w:sz w:val="18"/>
+                <w:sz w:val="19"/>
               </w:rPr>
               <w:t>Ejemplo: solicitar corrección</w:t>
             </w:r>
@@ -654,7 +668,7 @@
             <w:r>
               <w:rPr>
                 <w:b w:val="0"/>
-                <w:sz w:val="18"/>
+                <w:sz w:val="19"/>
               </w:rPr>
               <w:t>D01 · Pedido recibido por correo; D02 · Diferencias detectadas en el ERP</w:t>
             </w:r>
@@ -671,7 +685,7 @@
             <w:r>
               <w:rPr>
                 <w:b w:val="0"/>
-                <w:sz w:val="18"/>
+                <w:sz w:val="19"/>
               </w:rPr>
               <w:t>D03 · Solicitud por WhatsApp y respuesta del cliente</w:t>
             </w:r>
@@ -693,7 +707,7 @@
             <w:r>
               <w:rPr>
                 <w:b w:val="0"/>
-                <w:sz w:val="18"/>
+                <w:sz w:val="19"/>
               </w:rPr>
               <w:t>___</w:t>
             </w:r>
@@ -710,7 +724,7 @@
             <w:r>
               <w:rPr>
                 <w:b w:val="0"/>
-                <w:sz w:val="18"/>
+                <w:sz w:val="19"/>
               </w:rPr>
               <w:t>___</w:t>
             </w:r>
@@ -727,7 +741,7 @@
             <w:r>
               <w:rPr>
                 <w:b w:val="0"/>
-                <w:sz w:val="18"/>
+                <w:sz w:val="19"/>
               </w:rPr>
               <w:t>___</w:t>
             </w:r>
@@ -749,7 +763,7 @@
             <w:r>
               <w:rPr>
                 <w:b w:val="0"/>
-                <w:sz w:val="18"/>
+                <w:sz w:val="19"/>
               </w:rPr>
               <w:t>+ Agregar paso</w:t>
             </w:r>
@@ -766,7 +780,7 @@
             <w:r>
               <w:rPr>
                 <w:b w:val="0"/>
-                <w:sz w:val="18"/>
+                <w:sz w:val="19"/>
               </w:rPr>
               <w:t>___</w:t>
             </w:r>
@@ -783,7 +797,7 @@
             <w:r>
               <w:rPr>
                 <w:b w:val="0"/>
-                <w:sz w:val="18"/>
+                <w:sz w:val="19"/>
               </w:rPr>
               <w:t>___</w:t>
             </w:r>
@@ -821,6 +835,14 @@
         <w:tblStyle w:val="TableGrid"/>
         <w:tblW w:type="auto" w:w="0"/>
         <w:tblLook w:firstColumn="1" w:firstRow="1" w:lastColumn="0" w:lastRow="0" w:noHBand="0" w:noVBand="1" w:val="04A0"/>
+        <w:tblBorders>
+          <w:top w:val="single" w:sz="4" w:color="DFE3E7"/>
+          <w:left w:val="single" w:sz="4" w:color="DFE3E7"/>
+          <w:bottom w:val="single" w:sz="4" w:color="DFE3E7"/>
+          <w:right w:val="single" w:sz="4" w:color="DFE3E7"/>
+          <w:insideH w:val="single" w:sz="4" w:color="DFE3E7"/>
+          <w:insideV w:val="single" w:sz="4" w:color="DFE3E7"/>
+        </w:tblBorders>
       </w:tblPr>
       <w:tblGrid>
         <w:gridCol w:w="2074"/>
@@ -837,7 +859,7 @@
         <w:tc>
           <w:tcPr>
             <w:tcW w:type="dxa" w:w="2074"/>
-            <w:shd w:fill="E8EDF2"/>
+            <w:shd w:fill="F5F6F7"/>
           </w:tcPr>
           <w:p>
             <w:pPr>
@@ -846,7 +868,7 @@
             <w:r>
               <w:rPr>
                 <w:b/>
-                <w:sz w:val="18"/>
+                <w:sz w:val="19"/>
               </w:rPr>
               <w:t>ID y fuente concreta — enlace o ubicación, si existe</w:t>
             </w:r>
@@ -855,7 +877,7 @@
         <w:tc>
           <w:tcPr>
             <w:tcW w:type="dxa" w:w="2074"/>
-            <w:shd w:fill="E8EDF2"/>
+            <w:shd w:fill="F5F6F7"/>
           </w:tcPr>
           <w:p>
             <w:pPr>
@@ -864,7 +886,7 @@
             <w:r>
               <w:rPr>
                 <w:b/>
-                <w:sz w:val="18"/>
+                <w:sz w:val="19"/>
               </w:rPr>
               <w:t>¿Quién tiene acceso hoy?</w:t>
             </w:r>
@@ -873,7 +895,7 @@
         <w:tc>
           <w:tcPr>
             <w:tcW w:type="dxa" w:w="2074"/>
-            <w:shd w:fill="E8EDF2"/>
+            <w:shd w:fill="F5F6F7"/>
           </w:tcPr>
           <w:p>
             <w:pPr>
@@ -882,7 +904,7 @@
             <w:r>
               <w:rPr>
                 <w:b/>
-                <w:sz w:val="18"/>
+                <w:sz w:val="19"/>
               </w:rPr>
               <w:t>¿A quién contactar para autorizar el acceso?</w:t>
             </w:r>
@@ -891,7 +913,7 @@
         <w:tc>
           <w:tcPr>
             <w:tcW w:type="dxa" w:w="2074"/>
-            <w:shd w:fill="E8EDF2"/>
+            <w:shd w:fill="F5F6F7"/>
           </w:tcPr>
           <w:p>
             <w:pPr>
@@ -900,7 +922,7 @@
             <w:r>
               <w:rPr>
                 <w:b/>
-                <w:sz w:val="18"/>
+                <w:sz w:val="19"/>
               </w:rPr>
               <w:t>¿Quién lo habilita técnicamente, si es otra persona?</w:t>
             </w:r>
@@ -909,7 +931,7 @@
         <w:tc>
           <w:tcPr>
             <w:tcW w:type="dxa" w:w="2074"/>
-            <w:shd w:fill="E8EDF2"/>
+            <w:shd w:fill="F5F6F7"/>
           </w:tcPr>
           <w:p>
             <w:pPr>
@@ -918,7 +940,7 @@
             <w:r>
               <w:rPr>
                 <w:b/>
-                <w:sz w:val="18"/>
+                <w:sz w:val="19"/>
               </w:rPr>
               <w:t>Acceso necesario y estado</w:t>
             </w:r>
@@ -940,7 +962,7 @@
             <w:r>
               <w:rPr>
                 <w:b w:val="0"/>
-                <w:sz w:val="18"/>
+                <w:sz w:val="19"/>
               </w:rPr>
               <w:t>D01 · Buzón de pedidos: ___</w:t>
             </w:r>
@@ -957,7 +979,7 @@
             <w:r>
               <w:rPr>
                 <w:b w:val="0"/>
-                <w:sz w:val="18"/>
+                <w:sz w:val="19"/>
               </w:rPr>
               <w:t>Equipo de servicio al cliente</w:t>
             </w:r>
@@ -974,7 +996,7 @@
             <w:r>
               <w:rPr>
                 <w:b w:val="0"/>
-                <w:sz w:val="18"/>
+                <w:sz w:val="19"/>
               </w:rPr>
               <w:t>Nombre y correo: ___</w:t>
             </w:r>
@@ -991,7 +1013,7 @@
             <w:r>
               <w:rPr>
                 <w:b w:val="0"/>
-                <w:sz w:val="18"/>
+                <w:sz w:val="19"/>
               </w:rPr>
               <w:t>Contacto de IT: ___</w:t>
             </w:r>
@@ -1008,7 +1030,7 @@
             <w:r>
               <w:rPr>
                 <w:b w:val="0"/>
-                <w:sz w:val="18"/>
+                <w:sz w:val="19"/>
               </w:rPr>
               <w:t>Leer pedidos · Por solicitar</w:t>
             </w:r>
@@ -1030,7 +1052,7 @@
             <w:r>
               <w:rPr>
                 <w:b w:val="0"/>
-                <w:sz w:val="18"/>
+                <w:sz w:val="19"/>
               </w:rPr>
               <w:t>D02 · ERP, módulo de pedidos: ___</w:t>
             </w:r>
@@ -1047,7 +1069,7 @@
             <w:r>
               <w:rPr>
                 <w:b w:val="0"/>
-                <w:sz w:val="18"/>
+                <w:sz w:val="19"/>
               </w:rPr>
               <w:t>Analistas de operaciones</w:t>
             </w:r>
@@ -1064,7 +1086,7 @@
             <w:r>
               <w:rPr>
                 <w:b w:val="0"/>
-                <w:sz w:val="18"/>
+                <w:sz w:val="19"/>
               </w:rPr>
               <w:t>Nombre y correo: ___</w:t>
             </w:r>
@@ -1081,7 +1103,7 @@
             <w:r>
               <w:rPr>
                 <w:b w:val="0"/>
-                <w:sz w:val="18"/>
+                <w:sz w:val="19"/>
               </w:rPr>
               <w:t>Administrador: ___</w:t>
             </w:r>
@@ -1098,7 +1120,7 @@
             <w:r>
               <w:rPr>
                 <w:b w:val="0"/>
-                <w:sz w:val="18"/>
+                <w:sz w:val="19"/>
               </w:rPr>
               <w:t>Consultar datos · Por confirmar</w:t>
             </w:r>
@@ -1120,7 +1142,7 @@
             <w:r>
               <w:rPr>
                 <w:b w:val="0"/>
-                <w:sz w:val="18"/>
+                <w:sz w:val="19"/>
               </w:rPr>
               <w:t>D03 · WhatsApp, cuenta de atención: ___</w:t>
             </w:r>
@@ -1137,7 +1159,7 @@
             <w:r>
               <w:rPr>
                 <w:b w:val="0"/>
-                <w:sz w:val="18"/>
+                <w:sz w:val="19"/>
               </w:rPr>
               <w:t>Equipo de atención</w:t>
             </w:r>
@@ -1154,7 +1176,7 @@
             <w:r>
               <w:rPr>
                 <w:b w:val="0"/>
-                <w:sz w:val="18"/>
+                <w:sz w:val="19"/>
               </w:rPr>
               <w:t>Nombre y correo: ___</w:t>
             </w:r>
@@ -1171,7 +1193,7 @@
             <w:r>
               <w:rPr>
                 <w:b w:val="0"/>
-                <w:sz w:val="18"/>
+                <w:sz w:val="19"/>
               </w:rPr>
               <w:t>___</w:t>
             </w:r>
@@ -1188,7 +1210,7 @@
             <w:r>
               <w:rPr>
                 <w:b w:val="0"/>
-                <w:sz w:val="18"/>
+                <w:sz w:val="19"/>
               </w:rPr>
               <w:t>Consultar respuestas / enviar solicitudes · Por confirmar</w:t>
             </w:r>
@@ -1210,7 +1232,7 @@
             <w:r>
               <w:rPr>
                 <w:b w:val="0"/>
-                <w:sz w:val="18"/>
+                <w:sz w:val="19"/>
               </w:rPr>
               <w:t>___</w:t>
             </w:r>
@@ -1227,7 +1249,7 @@
             <w:r>
               <w:rPr>
                 <w:b w:val="0"/>
-                <w:sz w:val="18"/>
+                <w:sz w:val="19"/>
               </w:rPr>
               <w:t>___</w:t>
             </w:r>
@@ -1244,7 +1266,7 @@
             <w:r>
               <w:rPr>
                 <w:b w:val="0"/>
-                <w:sz w:val="18"/>
+                <w:sz w:val="19"/>
               </w:rPr>
               <w:t>___</w:t>
             </w:r>
@@ -1261,7 +1283,7 @@
             <w:r>
               <w:rPr>
                 <w:b w:val="0"/>
-                <w:sz w:val="18"/>
+                <w:sz w:val="19"/>
               </w:rPr>
               <w:t>___</w:t>
             </w:r>
@@ -1278,7 +1300,7 @@
             <w:r>
               <w:rPr>
                 <w:b w:val="0"/>
-                <w:sz w:val="18"/>
+                <w:sz w:val="19"/>
               </w:rPr>
               <w:t>___</w:t>
             </w:r>
@@ -1300,7 +1322,7 @@
             <w:r>
               <w:rPr>
                 <w:b w:val="0"/>
-                <w:sz w:val="18"/>
+                <w:sz w:val="19"/>
               </w:rPr>
               <w:t>+ Agregar fuente</w:t>
             </w:r>
@@ -1317,7 +1339,7 @@
             <w:r>
               <w:rPr>
                 <w:b w:val="0"/>
-                <w:sz w:val="18"/>
+                <w:sz w:val="19"/>
               </w:rPr>
               <w:t>___</w:t>
             </w:r>
@@ -1334,7 +1356,7 @@
             <w:r>
               <w:rPr>
                 <w:b w:val="0"/>
-                <w:sz w:val="18"/>
+                <w:sz w:val="19"/>
               </w:rPr>
               <w:t>___</w:t>
             </w:r>
@@ -1351,7 +1373,7 @@
             <w:r>
               <w:rPr>
                 <w:b w:val="0"/>
-                <w:sz w:val="18"/>
+                <w:sz w:val="19"/>
               </w:rPr>
               <w:t>___</w:t>
             </w:r>
@@ -1368,7 +1390,7 @@
             <w:r>
               <w:rPr>
                 <w:b w:val="0"/>
-                <w:sz w:val="18"/>
+                <w:sz w:val="19"/>
               </w:rPr>
               <w:t>___</w:t>
             </w:r>
@@ -1427,7 +1449,6 @@
     <w:p>
       <w:pPr>
         <w:pStyle w:val="Heading2"/>
-        <w:pageBreakBefore/>
       </w:pPr>
       <w:r>
         <w:t>Mapa de flujo de valor dónde se va el tiempo</w:t>
@@ -1545,6 +1566,14 @@
         <w:tblStyle w:val="TableGrid"/>
         <w:tblW w:type="auto" w:w="0"/>
         <w:tblLook w:firstColumn="1" w:firstRow="1" w:lastColumn="0" w:lastRow="0" w:noHBand="0" w:noVBand="1" w:val="04A0"/>
+        <w:tblBorders>
+          <w:top w:val="single" w:sz="4" w:color="DFE3E7"/>
+          <w:left w:val="single" w:sz="4" w:color="DFE3E7"/>
+          <w:bottom w:val="single" w:sz="4" w:color="DFE3E7"/>
+          <w:right w:val="single" w:sz="4" w:color="DFE3E7"/>
+          <w:insideH w:val="single" w:sz="4" w:color="DFE3E7"/>
+          <w:insideV w:val="single" w:sz="4" w:color="DFE3E7"/>
+        </w:tblBorders>
       </w:tblPr>
       <w:tblGrid>
         <w:gridCol w:w="1728"/>
@@ -1562,7 +1591,7 @@
         <w:tc>
           <w:tcPr>
             <w:tcW w:type="dxa" w:w="1728"/>
-            <w:shd w:fill="E8EDF2"/>
+            <w:shd w:fill="F5F6F7"/>
           </w:tcPr>
           <w:p>
             <w:pPr>
@@ -1571,7 +1600,7 @@
             <w:r>
               <w:rPr>
                 <w:b/>
-                <w:sz w:val="18"/>
+                <w:sz w:val="19"/>
               </w:rPr>
               <w:t>Paso, en orden</w:t>
             </w:r>
@@ -1580,7 +1609,7 @@
         <w:tc>
           <w:tcPr>
             <w:tcW w:type="dxa" w:w="1728"/>
-            <w:shd w:fill="E8EDF2"/>
+            <w:shd w:fill="F5F6F7"/>
           </w:tcPr>
           <w:p>
             <w:pPr>
@@ -1589,7 +1618,7 @@
             <w:r>
               <w:rPr>
                 <w:b/>
-                <w:sz w:val="18"/>
+                <w:sz w:val="19"/>
               </w:rPr>
               <w:t>Quién / sistema</w:t>
             </w:r>
@@ -1598,7 +1627,7 @@
         <w:tc>
           <w:tcPr>
             <w:tcW w:type="dxa" w:w="1728"/>
-            <w:shd w:fill="E8EDF2"/>
+            <w:shd w:fill="F5F6F7"/>
           </w:tcPr>
           <w:p>
             <w:pPr>
@@ -1607,7 +1636,7 @@
             <w:r>
               <w:rPr>
                 <w:b/>
-                <w:sz w:val="18"/>
+                <w:sz w:val="19"/>
               </w:rPr>
               <w:t>Tiempo activo (min/caso)</w:t>
             </w:r>
@@ -1616,7 +1645,7 @@
         <w:tc>
           <w:tcPr>
             <w:tcW w:type="dxa" w:w="1728"/>
-            <w:shd w:fill="E8EDF2"/>
+            <w:shd w:fill="F5F6F7"/>
           </w:tcPr>
           <w:p>
             <w:pPr>
@@ -1625,7 +1654,7 @@
             <w:r>
               <w:rPr>
                 <w:b/>
-                <w:sz w:val="18"/>
+                <w:sz w:val="19"/>
               </w:rPr>
               <w:t>Espera antes del paso (min/caso)</w:t>
             </w:r>
@@ -1634,7 +1663,7 @@
         <w:tc>
           <w:tcPr>
             <w:tcW w:type="dxa" w:w="1728"/>
-            <w:shd w:fill="E8EDF2"/>
+            <w:shd w:fill="F5F6F7"/>
           </w:tcPr>
           <w:p>
             <w:pPr>
@@ -1643,7 +1672,7 @@
             <w:r>
               <w:rPr>
                 <w:b/>
-                <w:sz w:val="18"/>
+                <w:sz w:val="19"/>
               </w:rPr>
               <w:t>Esfuerzo humano (min-persona por caso)</w:t>
             </w:r>
@@ -1652,7 +1681,7 @@
         <w:tc>
           <w:tcPr>
             <w:tcW w:type="dxa" w:w="1728"/>
-            <w:shd w:fill="E8EDF2"/>
+            <w:shd w:fill="F5F6F7"/>
           </w:tcPr>
           <w:p>
             <w:pPr>
@@ -1661,7 +1690,7 @@
             <w:r>
               <w:rPr>
                 <w:b/>
-                <w:sz w:val="18"/>
+                <w:sz w:val="19"/>
               </w:rPr>
               <w:t>¿Qué aporta? ¿Qué se atasca o repite?</w:t>
             </w:r>
@@ -1683,7 +1712,7 @@
             <w:r>
               <w:rPr>
                 <w:b w:val="0"/>
-                <w:sz w:val="18"/>
+                <w:sz w:val="19"/>
               </w:rPr>
               <w:t>1. ___</w:t>
             </w:r>
@@ -1700,7 +1729,7 @@
             <w:r>
               <w:rPr>
                 <w:b w:val="0"/>
-                <w:sz w:val="18"/>
+                <w:sz w:val="19"/>
               </w:rPr>
               <w:t>___</w:t>
             </w:r>
@@ -1717,7 +1746,7 @@
             <w:r>
               <w:rPr>
                 <w:b w:val="0"/>
-                <w:sz w:val="18"/>
+                <w:sz w:val="19"/>
               </w:rPr>
               <w:t>___</w:t>
             </w:r>
@@ -1734,7 +1763,7 @@
             <w:r>
               <w:rPr>
                 <w:b w:val="0"/>
-                <w:sz w:val="18"/>
+                <w:sz w:val="19"/>
               </w:rPr>
               <w:t>___</w:t>
             </w:r>
@@ -1751,7 +1780,7 @@
             <w:r>
               <w:rPr>
                 <w:b w:val="0"/>
-                <w:sz w:val="18"/>
+                <w:sz w:val="19"/>
               </w:rPr>
               <w:t>___</w:t>
             </w:r>
@@ -1768,7 +1797,7 @@
             <w:r>
               <w:rPr>
                 <w:b w:val="0"/>
-                <w:sz w:val="18"/>
+                <w:sz w:val="19"/>
               </w:rPr>
               <w:t>___</w:t>
             </w:r>
@@ -1790,7 +1819,7 @@
             <w:r>
               <w:rPr>
                 <w:b w:val="0"/>
-                <w:sz w:val="18"/>
+                <w:sz w:val="19"/>
               </w:rPr>
               <w:t>2. ___</w:t>
             </w:r>
@@ -1807,7 +1836,7 @@
             <w:r>
               <w:rPr>
                 <w:b w:val="0"/>
-                <w:sz w:val="18"/>
+                <w:sz w:val="19"/>
               </w:rPr>
               <w:t>___</w:t>
             </w:r>
@@ -1824,7 +1853,7 @@
             <w:r>
               <w:rPr>
                 <w:b w:val="0"/>
-                <w:sz w:val="18"/>
+                <w:sz w:val="19"/>
               </w:rPr>
               <w:t>___</w:t>
             </w:r>
@@ -1841,7 +1870,7 @@
             <w:r>
               <w:rPr>
                 <w:b w:val="0"/>
-                <w:sz w:val="18"/>
+                <w:sz w:val="19"/>
               </w:rPr>
               <w:t>___</w:t>
             </w:r>
@@ -1858,7 +1887,7 @@
             <w:r>
               <w:rPr>
                 <w:b w:val="0"/>
-                <w:sz w:val="18"/>
+                <w:sz w:val="19"/>
               </w:rPr>
               <w:t>___</w:t>
             </w:r>
@@ -1875,7 +1904,7 @@
             <w:r>
               <w:rPr>
                 <w:b w:val="0"/>
-                <w:sz w:val="18"/>
+                <w:sz w:val="19"/>
               </w:rPr>
               <w:t>___</w:t>
             </w:r>
@@ -1897,7 +1926,7 @@
             <w:r>
               <w:rPr>
                 <w:b w:val="0"/>
-                <w:sz w:val="18"/>
+                <w:sz w:val="19"/>
               </w:rPr>
               <w:t>3. ___</w:t>
             </w:r>
@@ -1914,7 +1943,7 @@
             <w:r>
               <w:rPr>
                 <w:b w:val="0"/>
-                <w:sz w:val="18"/>
+                <w:sz w:val="19"/>
               </w:rPr>
               <w:t>___</w:t>
             </w:r>
@@ -1931,7 +1960,7 @@
             <w:r>
               <w:rPr>
                 <w:b w:val="0"/>
-                <w:sz w:val="18"/>
+                <w:sz w:val="19"/>
               </w:rPr>
               <w:t>___</w:t>
             </w:r>
@@ -1948,7 +1977,7 @@
             <w:r>
               <w:rPr>
                 <w:b w:val="0"/>
-                <w:sz w:val="18"/>
+                <w:sz w:val="19"/>
               </w:rPr>
               <w:t>___</w:t>
             </w:r>
@@ -1965,7 +1994,7 @@
             <w:r>
               <w:rPr>
                 <w:b w:val="0"/>
-                <w:sz w:val="18"/>
+                <w:sz w:val="19"/>
               </w:rPr>
               <w:t>___</w:t>
             </w:r>
@@ -1982,7 +2011,7 @@
             <w:r>
               <w:rPr>
                 <w:b w:val="0"/>
-                <w:sz w:val="18"/>
+                <w:sz w:val="19"/>
               </w:rPr>
               <w:t>___</w:t>
             </w:r>
@@ -2004,7 +2033,7 @@
             <w:r>
               <w:rPr>
                 <w:b w:val="0"/>
-                <w:sz w:val="18"/>
+                <w:sz w:val="19"/>
               </w:rPr>
               <w:t>+ Agregar paso</w:t>
             </w:r>
@@ -2021,7 +2050,7 @@
             <w:r>
               <w:rPr>
                 <w:b w:val="0"/>
-                <w:sz w:val="18"/>
+                <w:sz w:val="19"/>
               </w:rPr>
               <w:t>___</w:t>
             </w:r>
@@ -2038,7 +2067,7 @@
             <w:r>
               <w:rPr>
                 <w:b w:val="0"/>
-                <w:sz w:val="18"/>
+                <w:sz w:val="19"/>
               </w:rPr>
               <w:t>___</w:t>
             </w:r>
@@ -2055,7 +2084,7 @@
             <w:r>
               <w:rPr>
                 <w:b w:val="0"/>
-                <w:sz w:val="18"/>
+                <w:sz w:val="19"/>
               </w:rPr>
               <w:t>___</w:t>
             </w:r>
@@ -2072,7 +2101,7 @@
             <w:r>
               <w:rPr>
                 <w:b w:val="0"/>
-                <w:sz w:val="18"/>
+                <w:sz w:val="19"/>
               </w:rPr>
               <w:t>___</w:t>
             </w:r>
@@ -2089,7 +2118,7 @@
             <w:r>
               <w:rPr>
                 <w:b w:val="0"/>
-                <w:sz w:val="18"/>
+                <w:sz w:val="19"/>
               </w:rPr>
               <w:t>___</w:t>
             </w:r>
@@ -2103,6 +2132,9 @@
       </w:pPr>
     </w:p>
     <w:p>
+      <w:pPr>
+        <w:keepNext/>
+      </w:pPr>
       <w:r>
         <w:rPr>
           <w:b w:val="0"/>
@@ -2125,6 +2157,14 @@
         <w:tblStyle w:val="TableGrid"/>
         <w:tblW w:type="auto" w:w="0"/>
         <w:tblLook w:firstColumn="1" w:firstRow="1" w:lastColumn="0" w:lastRow="0" w:noHBand="0" w:noVBand="1" w:val="04A0"/>
+        <w:tblBorders>
+          <w:top w:val="single" w:sz="4" w:color="DFE3E7"/>
+          <w:left w:val="single" w:sz="4" w:color="DFE3E7"/>
+          <w:bottom w:val="single" w:sz="4" w:color="DFE3E7"/>
+          <w:right w:val="single" w:sz="4" w:color="DFE3E7"/>
+          <w:insideH w:val="single" w:sz="4" w:color="DFE3E7"/>
+          <w:insideV w:val="single" w:sz="4" w:color="DFE3E7"/>
+        </w:tblBorders>
       </w:tblPr>
       <w:tblGrid>
         <w:gridCol w:w="1728"/>
@@ -2142,7 +2182,7 @@
         <w:tc>
           <w:tcPr>
             <w:tcW w:type="dxa" w:w="1728"/>
-            <w:shd w:fill="E8EDF2"/>
+            <w:shd w:fill="F5F6F7"/>
           </w:tcPr>
           <w:p>
             <w:pPr>
@@ -2151,7 +2191,7 @@
             <w:r>
               <w:rPr>
                 <w:b/>
-                <w:sz w:val="18"/>
+                <w:sz w:val="19"/>
               </w:rPr>
               <w:t>Paso</w:t>
             </w:r>
@@ -2160,7 +2200,7 @@
         <w:tc>
           <w:tcPr>
             <w:tcW w:type="dxa" w:w="1728"/>
-            <w:shd w:fill="E8EDF2"/>
+            <w:shd w:fill="F5F6F7"/>
           </w:tcPr>
           <w:p>
             <w:pPr>
@@ -2169,7 +2209,7 @@
             <w:r>
               <w:rPr>
                 <w:b/>
-                <w:sz w:val="18"/>
+                <w:sz w:val="19"/>
               </w:rPr>
               <w:t>Quién / sistema</w:t>
             </w:r>
@@ -2178,7 +2218,7 @@
         <w:tc>
           <w:tcPr>
             <w:tcW w:type="dxa" w:w="1728"/>
-            <w:shd w:fill="E8EDF2"/>
+            <w:shd w:fill="F5F6F7"/>
           </w:tcPr>
           <w:p>
             <w:pPr>
@@ -2187,7 +2227,7 @@
             <w:r>
               <w:rPr>
                 <w:b/>
-                <w:sz w:val="18"/>
+                <w:sz w:val="19"/>
               </w:rPr>
               <w:t>Activo</w:t>
             </w:r>
@@ -2196,7 +2236,7 @@
         <w:tc>
           <w:tcPr>
             <w:tcW w:type="dxa" w:w="1728"/>
-            <w:shd w:fill="E8EDF2"/>
+            <w:shd w:fill="F5F6F7"/>
           </w:tcPr>
           <w:p>
             <w:pPr>
@@ -2205,7 +2245,7 @@
             <w:r>
               <w:rPr>
                 <w:b/>
-                <w:sz w:val="18"/>
+                <w:sz w:val="19"/>
               </w:rPr>
               <w:t>Espera previa</w:t>
             </w:r>
@@ -2214,7 +2254,7 @@
         <w:tc>
           <w:tcPr>
             <w:tcW w:type="dxa" w:w="1728"/>
-            <w:shd w:fill="E8EDF2"/>
+            <w:shd w:fill="F5F6F7"/>
           </w:tcPr>
           <w:p>
             <w:pPr>
@@ -2223,7 +2263,7 @@
             <w:r>
               <w:rPr>
                 <w:b/>
-                <w:sz w:val="18"/>
+                <w:sz w:val="19"/>
               </w:rPr>
               <w:t>Esfuerzo humano</w:t>
             </w:r>
@@ -2232,7 +2272,7 @@
         <w:tc>
           <w:tcPr>
             <w:tcW w:type="dxa" w:w="1728"/>
-            <w:shd w:fill="E8EDF2"/>
+            <w:shd w:fill="F5F6F7"/>
           </w:tcPr>
           <w:p>
             <w:pPr>
@@ -2241,7 +2281,7 @@
             <w:r>
               <w:rPr>
                 <w:b/>
-                <w:sz w:val="18"/>
+                <w:sz w:val="19"/>
               </w:rPr>
               <w:t>Aporte o problema</w:t>
             </w:r>
@@ -2263,7 +2303,7 @@
             <w:r>
               <w:rPr>
                 <w:b w:val="0"/>
-                <w:sz w:val="18"/>
+                <w:sz w:val="19"/>
               </w:rPr>
               <w:t>Preparar datos</w:t>
             </w:r>
@@ -2280,7 +2320,7 @@
             <w:r>
               <w:rPr>
                 <w:b w:val="0"/>
-                <w:sz w:val="18"/>
+                <w:sz w:val="19"/>
               </w:rPr>
               <w:t>Servicio al cliente / correo</w:t>
             </w:r>
@@ -2297,7 +2337,7 @@
             <w:r>
               <w:rPr>
                 <w:b w:val="0"/>
-                <w:sz w:val="18"/>
+                <w:sz w:val="19"/>
               </w:rPr>
               <w:t>5 min</w:t>
             </w:r>
@@ -2314,7 +2354,7 @@
             <w:r>
               <w:rPr>
                 <w:b w:val="0"/>
-                <w:sz w:val="18"/>
+                <w:sz w:val="19"/>
               </w:rPr>
               <w:t>0 min</w:t>
             </w:r>
@@ -2331,7 +2371,7 @@
             <w:r>
               <w:rPr>
                 <w:b w:val="0"/>
-                <w:sz w:val="18"/>
+                <w:sz w:val="19"/>
               </w:rPr>
               <w:t>5 min-persona</w:t>
             </w:r>
@@ -2348,7 +2388,7 @@
             <w:r>
               <w:rPr>
                 <w:b w:val="0"/>
-                <w:sz w:val="18"/>
+                <w:sz w:val="19"/>
               </w:rPr>
               <w:t>Organizar la información recibida</w:t>
             </w:r>
@@ -2370,7 +2410,7 @@
             <w:r>
               <w:rPr>
                 <w:b w:val="0"/>
-                <w:sz w:val="18"/>
+                <w:sz w:val="19"/>
               </w:rPr>
               <w:t>Validar</w:t>
             </w:r>
@@ -2387,7 +2427,7 @@
             <w:r>
               <w:rPr>
                 <w:b w:val="0"/>
-                <w:sz w:val="18"/>
+                <w:sz w:val="19"/>
               </w:rPr>
               <w:t>Analista / ERP</w:t>
             </w:r>
@@ -2404,7 +2444,7 @@
             <w:r>
               <w:rPr>
                 <w:b w:val="0"/>
-                <w:sz w:val="18"/>
+                <w:sz w:val="19"/>
               </w:rPr>
               <w:t>10 min</w:t>
             </w:r>
@@ -2421,7 +2461,7 @@
             <w:r>
               <w:rPr>
                 <w:b w:val="0"/>
-                <w:sz w:val="18"/>
+                <w:sz w:val="19"/>
               </w:rPr>
               <w:t>120 min</w:t>
             </w:r>
@@ -2438,7 +2478,7 @@
             <w:r>
               <w:rPr>
                 <w:b w:val="0"/>
-                <w:sz w:val="18"/>
+                <w:sz w:val="19"/>
               </w:rPr>
               <w:t>10 min-persona</w:t>
             </w:r>
@@ -2455,7 +2495,7 @@
             <w:r>
               <w:rPr>
                 <w:b w:val="0"/>
-                <w:sz w:val="18"/>
+                <w:sz w:val="19"/>
               </w:rPr>
               <w:t>Comprobar datos; el pedido espera en una bandeja</w:t>
             </w:r>
@@ -2477,7 +2517,7 @@
             <w:r>
               <w:rPr>
                 <w:b w:val="0"/>
-                <w:sz w:val="18"/>
+                <w:sz w:val="19"/>
               </w:rPr>
               <w:t>Registrar</w:t>
             </w:r>
@@ -2494,7 +2534,7 @@
             <w:r>
               <w:rPr>
                 <w:b w:val="0"/>
-                <w:sz w:val="18"/>
+                <w:sz w:val="19"/>
               </w:rPr>
               <w:t>Operaciones / ERP</w:t>
             </w:r>
@@ -2511,7 +2551,7 @@
             <w:r>
               <w:rPr>
                 <w:b w:val="0"/>
-                <w:sz w:val="18"/>
+                <w:sz w:val="19"/>
               </w:rPr>
               <w:t>5 min</w:t>
             </w:r>
@@ -2528,7 +2568,7 @@
             <w:r>
               <w:rPr>
                 <w:b w:val="0"/>
-                <w:sz w:val="18"/>
+                <w:sz w:val="19"/>
               </w:rPr>
               <w:t>30 min</w:t>
             </w:r>
@@ -2545,7 +2585,7 @@
             <w:r>
               <w:rPr>
                 <w:b w:val="0"/>
-                <w:sz w:val="18"/>
+                <w:sz w:val="19"/>
               </w:rPr>
               <w:t>5 min-persona</w:t>
             </w:r>
@@ -2562,7 +2602,7 @@
             <w:r>
               <w:rPr>
                 <w:b w:val="0"/>
-                <w:sz w:val="18"/>
+                <w:sz w:val="19"/>
               </w:rPr>
               <w:t>Crear el registro; se vuelven a copiar datos</w:t>
             </w:r>
@@ -2584,20 +2624,20 @@
             <w:r>
               <w:rPr>
                 <w:b w:val="0"/>
-                <w:sz w:val="18"/>
+                <w:sz w:val="19"/>
               </w:rPr>
             </w:r>
             <w:r>
               <w:rPr>
                 <w:b/>
-                <w:sz w:val="18"/>
+                <w:sz w:val="19"/>
               </w:rPr>
               <w:t>Total</w:t>
             </w:r>
             <w:r>
               <w:rPr>
                 <w:b w:val="0"/>
-                <w:sz w:val="18"/>
+                <w:sz w:val="19"/>
               </w:rPr>
             </w:r>
           </w:p>
@@ -2613,7 +2653,7 @@
             <w:r>
               <w:rPr>
                 <w:b w:val="0"/>
-                <w:sz w:val="18"/>
+                <w:sz w:val="19"/>
               </w:rPr>
             </w:r>
           </w:p>
@@ -2629,20 +2669,20 @@
             <w:r>
               <w:rPr>
                 <w:b w:val="0"/>
-                <w:sz w:val="18"/>
+                <w:sz w:val="19"/>
               </w:rPr>
             </w:r>
             <w:r>
               <w:rPr>
                 <w:b/>
-                <w:sz w:val="18"/>
+                <w:sz w:val="19"/>
               </w:rPr>
               <w:t>20 min</w:t>
             </w:r>
             <w:r>
               <w:rPr>
                 <w:b w:val="0"/>
-                <w:sz w:val="18"/>
+                <w:sz w:val="19"/>
               </w:rPr>
             </w:r>
           </w:p>
@@ -2658,20 +2698,20 @@
             <w:r>
               <w:rPr>
                 <w:b w:val="0"/>
-                <w:sz w:val="18"/>
+                <w:sz w:val="19"/>
               </w:rPr>
             </w:r>
             <w:r>
               <w:rPr>
                 <w:b/>
-                <w:sz w:val="18"/>
+                <w:sz w:val="19"/>
               </w:rPr>
               <w:t>150 min</w:t>
             </w:r>
             <w:r>
               <w:rPr>
                 <w:b w:val="0"/>
-                <w:sz w:val="18"/>
+                <w:sz w:val="19"/>
               </w:rPr>
             </w:r>
           </w:p>
@@ -2687,20 +2727,20 @@
             <w:r>
               <w:rPr>
                 <w:b w:val="0"/>
-                <w:sz w:val="18"/>
+                <w:sz w:val="19"/>
               </w:rPr>
             </w:r>
             <w:r>
               <w:rPr>
                 <w:b/>
-                <w:sz w:val="18"/>
+                <w:sz w:val="19"/>
               </w:rPr>
               <w:t>20 min-persona</w:t>
             </w:r>
             <w:r>
               <w:rPr>
                 <w:b w:val="0"/>
-                <w:sz w:val="18"/>
+                <w:sz w:val="19"/>
               </w:rPr>
             </w:r>
           </w:p>
@@ -2716,20 +2756,20 @@
             <w:r>
               <w:rPr>
                 <w:b w:val="0"/>
-                <w:sz w:val="18"/>
+                <w:sz w:val="19"/>
               </w:rPr>
             </w:r>
             <w:r>
               <w:rPr>
                 <w:b/>
-                <w:sz w:val="18"/>
+                <w:sz w:val="19"/>
               </w:rPr>
               <w:t>170 min de principio a fin</w:t>
             </w:r>
             <w:r>
               <w:rPr>
                 <w:b w:val="0"/>
-                <w:sz w:val="18"/>
+                <w:sz w:val="19"/>
               </w:rPr>
             </w:r>
           </w:p>
@@ -2788,7 +2828,6 @@
     <w:p>
       <w:pPr>
         <w:pStyle w:val="Heading1"/>
-        <w:pageBreakBefore/>
       </w:pPr>
       <w:r>
         <w:t>5. Acordemos qué vamos a medir</w:t>
@@ -2862,6 +2901,14 @@
         <w:tblStyle w:val="TableGrid"/>
         <w:tblW w:type="auto" w:w="0"/>
         <w:tblLook w:firstColumn="1" w:firstRow="1" w:lastColumn="0" w:lastRow="0" w:noHBand="0" w:noVBand="1" w:val="04A0"/>
+        <w:tblBorders>
+          <w:top w:val="single" w:sz="4" w:color="DFE3E7"/>
+          <w:left w:val="single" w:sz="4" w:color="DFE3E7"/>
+          <w:bottom w:val="single" w:sz="4" w:color="DFE3E7"/>
+          <w:right w:val="single" w:sz="4" w:color="DFE3E7"/>
+          <w:insideH w:val="single" w:sz="4" w:color="DFE3E7"/>
+          <w:insideV w:val="single" w:sz="4" w:color="DFE3E7"/>
+        </w:tblBorders>
       </w:tblPr>
       <w:tblGrid>
         <w:gridCol w:w="2592"/>
@@ -2877,7 +2924,7 @@
         <w:tc>
           <w:tcPr>
             <w:tcW w:type="dxa" w:w="2592"/>
-            <w:shd w:fill="E8EDF2"/>
+            <w:shd w:fill="F5F6F7"/>
           </w:tcPr>
           <w:p>
             <w:pPr>
@@ -2886,7 +2933,7 @@
             <w:r>
               <w:rPr>
                 <w:b/>
-                <w:sz w:val="18"/>
+                <w:sz w:val="19"/>
               </w:rPr>
               <w:t>Dato que vamos a registrar</w:t>
             </w:r>
@@ -2895,7 +2942,7 @@
         <w:tc>
           <w:tcPr>
             <w:tcW w:type="dxa" w:w="2592"/>
-            <w:shd w:fill="E8EDF2"/>
+            <w:shd w:fill="F5F6F7"/>
           </w:tcPr>
           <w:p>
             <w:pPr>
@@ -2904,7 +2951,7 @@
             <w:r>
               <w:rPr>
                 <w:b/>
-                <w:sz w:val="18"/>
+                <w:sz w:val="19"/>
               </w:rPr>
               <w:t>Valor actual</w:t>
             </w:r>
@@ -2913,7 +2960,7 @@
         <w:tc>
           <w:tcPr>
             <w:tcW w:type="dxa" w:w="2592"/>
-            <w:shd w:fill="E8EDF2"/>
+            <w:shd w:fill="F5F6F7"/>
           </w:tcPr>
           <w:p>
             <w:pPr>
@@ -2922,7 +2969,7 @@
             <w:r>
               <w:rPr>
                 <w:b/>
-                <w:sz w:val="18"/>
+                <w:sz w:val="19"/>
               </w:rPr>
               <w:t>Meta, si aplica</w:t>
             </w:r>
@@ -2931,7 +2978,7 @@
         <w:tc>
           <w:tcPr>
             <w:tcW w:type="dxa" w:w="2592"/>
-            <w:shd w:fill="E8EDF2"/>
+            <w:shd w:fill="F5F6F7"/>
           </w:tcPr>
           <w:p>
             <w:pPr>
@@ -2940,7 +2987,7 @@
             <w:r>
               <w:rPr>
                 <w:b/>
-                <w:sz w:val="18"/>
+                <w:sz w:val="19"/>
               </w:rPr>
               <w:t>Fuente y estado: medido / estimado / por medir</w:t>
             </w:r>
@@ -2962,7 +3009,7 @@
             <w:r>
               <w:rPr>
                 <w:b w:val="0"/>
-                <w:sz w:val="18"/>
+                <w:sz w:val="19"/>
               </w:rPr>
               <w:t>Volumen: casos procesados al mes</w:t>
             </w:r>
@@ -2979,7 +3026,7 @@
             <w:r>
               <w:rPr>
                 <w:b w:val="0"/>
-                <w:sz w:val="18"/>
+                <w:sz w:val="19"/>
               </w:rPr>
               <w:t>___ casos/mes</w:t>
             </w:r>
@@ -2996,7 +3043,7 @@
             <w:r>
               <w:rPr>
                 <w:b w:val="0"/>
-                <w:sz w:val="18"/>
+                <w:sz w:val="19"/>
               </w:rPr>
               <w:t>___</w:t>
             </w:r>
@@ -3013,7 +3060,7 @@
             <w:r>
               <w:rPr>
                 <w:b w:val="0"/>
-                <w:sz w:val="18"/>
+                <w:sz w:val="19"/>
               </w:rPr>
               <w:t>___</w:t>
             </w:r>
@@ -3035,7 +3082,7 @@
             <w:r>
               <w:rPr>
                 <w:b w:val="0"/>
-                <w:sz w:val="18"/>
+                <w:sz w:val="19"/>
               </w:rPr>
               <w:t>Esfuerzo por caso, sumando a todas las personas</w:t>
             </w:r>
@@ -3052,7 +3099,7 @@
             <w:r>
               <w:rPr>
                 <w:b w:val="0"/>
-                <w:sz w:val="18"/>
+                <w:sz w:val="19"/>
               </w:rPr>
               <w:t>___ min-persona por caso</w:t>
             </w:r>
@@ -3069,7 +3116,7 @@
             <w:r>
               <w:rPr>
                 <w:b w:val="0"/>
-                <w:sz w:val="18"/>
+                <w:sz w:val="19"/>
               </w:rPr>
               <w:t>___</w:t>
             </w:r>
@@ -3086,7 +3133,7 @@
             <w:r>
               <w:rPr>
                 <w:b w:val="0"/>
-                <w:sz w:val="18"/>
+                <w:sz w:val="19"/>
               </w:rPr>
               <w:t>___</w:t>
             </w:r>
@@ -3108,20 +3155,20 @@
             <w:r>
               <w:rPr>
                 <w:b w:val="0"/>
-                <w:sz w:val="18"/>
+                <w:sz w:val="19"/>
               </w:rPr>
             </w:r>
             <w:r>
               <w:rPr>
                 <w:b/>
-                <w:sz w:val="18"/>
+                <w:sz w:val="19"/>
               </w:rPr>
               <w:t>Horas-hombre u horas-persona totales</w:t>
             </w:r>
             <w:r>
               <w:rPr>
                 <w:b w:val="0"/>
-                <w:sz w:val="18"/>
+                <w:sz w:val="19"/>
               </w:rPr>
               <w:t xml:space="preserve"> dedicadas al workflow</w:t>
             </w:r>
@@ -3138,7 +3185,7 @@
             <w:r>
               <w:rPr>
                 <w:b w:val="0"/>
-                <w:sz w:val="18"/>
+                <w:sz w:val="19"/>
               </w:rPr>
               <w:t>___ h-persona/mes</w:t>
             </w:r>
@@ -3155,7 +3202,7 @@
             <w:r>
               <w:rPr>
                 <w:b w:val="0"/>
-                <w:sz w:val="18"/>
+                <w:sz w:val="19"/>
               </w:rPr>
               <w:t>___</w:t>
             </w:r>
@@ -3172,7 +3219,7 @@
             <w:r>
               <w:rPr>
                 <w:b w:val="0"/>
-                <w:sz w:val="18"/>
+                <w:sz w:val="19"/>
               </w:rPr>
               <w:t>___</w:t>
             </w:r>
@@ -3194,7 +3241,7 @@
             <w:r>
               <w:rPr>
                 <w:b w:val="0"/>
-                <w:sz w:val="18"/>
+                <w:sz w:val="19"/>
               </w:rPr>
               <w:t>Tiempo de principio a fin</w:t>
             </w:r>
@@ -3211,7 +3258,7 @@
             <w:r>
               <w:rPr>
                 <w:b w:val="0"/>
-                <w:sz w:val="18"/>
+                <w:sz w:val="19"/>
               </w:rPr>
               <w:t>___ min o h/caso</w:t>
             </w:r>
@@ -3228,7 +3275,7 @@
             <w:r>
               <w:rPr>
                 <w:b w:val="0"/>
-                <w:sz w:val="18"/>
+                <w:sz w:val="19"/>
               </w:rPr>
               <w:t>___</w:t>
             </w:r>
@@ -3245,7 +3292,7 @@
             <w:r>
               <w:rPr>
                 <w:b w:val="0"/>
-                <w:sz w:val="18"/>
+                <w:sz w:val="19"/>
               </w:rPr>
               <w:t>___</w:t>
             </w:r>
@@ -3267,7 +3314,7 @@
             <w:r>
               <w:rPr>
                 <w:b w:val="0"/>
-                <w:sz w:val="18"/>
+                <w:sz w:val="19"/>
               </w:rPr>
               <w:t>Tiempo de espera dentro de ese recorrido</w:t>
             </w:r>
@@ -3284,7 +3331,7 @@
             <w:r>
               <w:rPr>
                 <w:b w:val="0"/>
-                <w:sz w:val="18"/>
+                <w:sz w:val="19"/>
               </w:rPr>
               <w:t>___ min o h/caso</w:t>
             </w:r>
@@ -3301,7 +3348,7 @@
             <w:r>
               <w:rPr>
                 <w:b w:val="0"/>
-                <w:sz w:val="18"/>
+                <w:sz w:val="19"/>
               </w:rPr>
               <w:t>___</w:t>
             </w:r>
@@ -3318,7 +3365,7 @@
             <w:r>
               <w:rPr>
                 <w:b w:val="0"/>
-                <w:sz w:val="18"/>
+                <w:sz w:val="19"/>
               </w:rPr>
               <w:t>___</w:t>
             </w:r>
@@ -3340,7 +3387,7 @@
             <w:r>
               <w:rPr>
                 <w:b w:val="0"/>
-                <w:sz w:val="18"/>
+                <w:sz w:val="19"/>
               </w:rPr>
               <w:t>Casos con error o corrección / casos revisados</w:t>
             </w:r>
@@ -3357,7 +3404,7 @@
             <w:r>
               <w:rPr>
                 <w:b w:val="0"/>
-                <w:sz w:val="18"/>
+                <w:sz w:val="19"/>
               </w:rPr>
               <w:t>___ / ___ = ___ %</w:t>
             </w:r>
@@ -3374,7 +3421,7 @@
             <w:r>
               <w:rPr>
                 <w:b w:val="0"/>
-                <w:sz w:val="18"/>
+                <w:sz w:val="19"/>
               </w:rPr>
               <w:t>___ %</w:t>
             </w:r>
@@ -3391,7 +3438,7 @@
             <w:r>
               <w:rPr>
                 <w:b w:val="0"/>
-                <w:sz w:val="18"/>
+                <w:sz w:val="19"/>
               </w:rPr>
               <w:t>___</w:t>
             </w:r>
@@ -3413,7 +3460,7 @@
             <w:r>
               <w:rPr>
                 <w:b w:val="0"/>
-                <w:sz w:val="18"/>
+                <w:sz w:val="19"/>
               </w:rPr>
               <w:t>Resultado de negocio elegido: ___</w:t>
             </w:r>
@@ -3430,7 +3477,7 @@
             <w:r>
               <w:rPr>
                 <w:b w:val="0"/>
-                <w:sz w:val="18"/>
+                <w:sz w:val="19"/>
               </w:rPr>
               <w:t>___ [unidad]</w:t>
             </w:r>
@@ -3447,7 +3494,7 @@
             <w:r>
               <w:rPr>
                 <w:b w:val="0"/>
-                <w:sz w:val="18"/>
+                <w:sz w:val="19"/>
               </w:rPr>
               <w:t>___ [unidad]</w:t>
             </w:r>
@@ -3464,7 +3511,7 @@
             <w:r>
               <w:rPr>
                 <w:b w:val="0"/>
-                <w:sz w:val="18"/>
+                <w:sz w:val="19"/>
               </w:rPr>
               <w:t>___</w:t>
             </w:r>
@@ -3486,7 +3533,7 @@
             <w:r>
               <w:rPr>
                 <w:b w:val="0"/>
-                <w:sz w:val="18"/>
+                <w:sz w:val="19"/>
               </w:rPr>
               <w:t>+ Agregar otra métrica: ___</w:t>
             </w:r>
@@ -3503,7 +3550,7 @@
             <w:r>
               <w:rPr>
                 <w:b w:val="0"/>
-                <w:sz w:val="18"/>
+                <w:sz w:val="19"/>
               </w:rPr>
               <w:t>___ [unidad/periodo]</w:t>
             </w:r>
@@ -3520,7 +3567,7 @@
             <w:r>
               <w:rPr>
                 <w:b w:val="0"/>
-                <w:sz w:val="18"/>
+                <w:sz w:val="19"/>
               </w:rPr>
               <w:t>___</w:t>
             </w:r>
@@ -3537,7 +3584,7 @@
             <w:r>
               <w:rPr>
                 <w:b w:val="0"/>
-                <w:sz w:val="18"/>
+                <w:sz w:val="19"/>
               </w:rPr>
               <w:t>___</w:t>
             </w:r>
@@ -3570,6 +3617,9 @@
       </w:r>
     </w:p>
     <w:p>
+      <w:pPr>
+        <w:keepNext/>
+      </w:pPr>
       <w:r>
         <w:rPr>
           <w:b w:val="0"/>
@@ -3592,6 +3642,14 @@
         <w:tblStyle w:val="TableGrid"/>
         <w:tblW w:type="auto" w:w="0"/>
         <w:tblLook w:firstColumn="1" w:firstRow="1" w:lastColumn="0" w:lastRow="0" w:noHBand="0" w:noVBand="1" w:val="04A0"/>
+        <w:tblBorders>
+          <w:top w:val="single" w:sz="4" w:color="DFE3E7"/>
+          <w:left w:val="single" w:sz="4" w:color="DFE3E7"/>
+          <w:bottom w:val="single" w:sz="4" w:color="DFE3E7"/>
+          <w:right w:val="single" w:sz="4" w:color="DFE3E7"/>
+          <w:insideH w:val="single" w:sz="4" w:color="DFE3E7"/>
+          <w:insideV w:val="single" w:sz="4" w:color="DFE3E7"/>
+        </w:tblBorders>
       </w:tblPr>
       <w:tblGrid>
         <w:gridCol w:w="3456"/>
@@ -3606,7 +3664,7 @@
         <w:tc>
           <w:tcPr>
             <w:tcW w:type="dxa" w:w="3456"/>
-            <w:shd w:fill="E8EDF2"/>
+            <w:shd w:fill="F5F6F7"/>
           </w:tcPr>
           <w:p>
             <w:pPr>
@@ -3615,7 +3673,7 @@
             <w:r>
               <w:rPr>
                 <w:b/>
-                <w:sz w:val="18"/>
+                <w:sz w:val="19"/>
               </w:rPr>
               <w:t>Indicador</w:t>
             </w:r>
@@ -3624,7 +3682,7 @@
         <w:tc>
           <w:tcPr>
             <w:tcW w:type="dxa" w:w="3456"/>
-            <w:shd w:fill="E8EDF2"/>
+            <w:shd w:fill="F5F6F7"/>
           </w:tcPr>
           <w:p>
             <w:pPr>
@@ -3633,7 +3691,7 @@
             <w:r>
               <w:rPr>
                 <w:b/>
-                <w:sz w:val="18"/>
+                <w:sz w:val="19"/>
               </w:rPr>
               <w:t>Actual</w:t>
             </w:r>
@@ -3642,7 +3700,7 @@
         <w:tc>
           <w:tcPr>
             <w:tcW w:type="dxa" w:w="3456"/>
-            <w:shd w:fill="E8EDF2"/>
+            <w:shd w:fill="F5F6F7"/>
           </w:tcPr>
           <w:p>
             <w:pPr>
@@ -3651,7 +3709,7 @@
             <w:r>
               <w:rPr>
                 <w:b/>
-                <w:sz w:val="18"/>
+                <w:sz w:val="19"/>
               </w:rPr>
               <w:t>Meta</w:t>
             </w:r>
@@ -3673,7 +3731,7 @@
             <w:r>
               <w:rPr>
                 <w:b w:val="0"/>
-                <w:sz w:val="18"/>
+                <w:sz w:val="19"/>
               </w:rPr>
               <w:t>Volumen de referencia</w:t>
             </w:r>
@@ -3690,7 +3748,7 @@
             <w:r>
               <w:rPr>
                 <w:b w:val="0"/>
-                <w:sz w:val="18"/>
+                <w:sz w:val="19"/>
               </w:rPr>
               <w:t>600 pedidos/mes</w:t>
             </w:r>
@@ -3707,7 +3765,7 @@
             <w:r>
               <w:rPr>
                 <w:b w:val="0"/>
-                <w:sz w:val="18"/>
+                <w:sz w:val="19"/>
               </w:rPr>
               <w:t>Mismo volumen para comparar</w:t>
             </w:r>
@@ -3729,7 +3787,7 @@
             <w:r>
               <w:rPr>
                 <w:b w:val="0"/>
-                <w:sz w:val="18"/>
+                <w:sz w:val="19"/>
               </w:rPr>
               <w:t>Esfuerzo humano promedio, incluidas correcciones</w:t>
             </w:r>
@@ -3746,7 +3804,7 @@
             <w:r>
               <w:rPr>
                 <w:b w:val="0"/>
-                <w:sz w:val="18"/>
+                <w:sz w:val="19"/>
               </w:rPr>
               <w:t>24 min-persona/pedido</w:t>
             </w:r>
@@ -3763,7 +3821,7 @@
             <w:r>
               <w:rPr>
                 <w:b w:val="0"/>
-                <w:sz w:val="18"/>
+                <w:sz w:val="19"/>
               </w:rPr>
               <w:t>12 min-persona/pedido</w:t>
             </w:r>
@@ -3785,7 +3843,7 @@
             <w:r>
               <w:rPr>
                 <w:b w:val="0"/>
-                <w:sz w:val="18"/>
+                <w:sz w:val="19"/>
               </w:rPr>
               <w:t>Horas-persona mensuales</w:t>
             </w:r>
@@ -3802,21 +3860,21 @@
             <w:r>
               <w:rPr>
                 <w:b w:val="0"/>
-                <w:sz w:val="18"/>
+                <w:sz w:val="19"/>
               </w:rPr>
               <w:t xml:space="preserve">600 × 24 ÷ 60 = </w:t>
             </w:r>
             <w:r>
               <w:rPr>
                 <w:b/>
-                <w:sz w:val="18"/>
+                <w:sz w:val="19"/>
               </w:rPr>
               <w:t>240 h</w:t>
             </w:r>
             <w:r>
               <w:rPr>
                 <w:b w:val="0"/>
-                <w:sz w:val="18"/>
+                <w:sz w:val="19"/>
               </w:rPr>
             </w:r>
           </w:p>
@@ -3832,21 +3890,21 @@
             <w:r>
               <w:rPr>
                 <w:b w:val="0"/>
-                <w:sz w:val="18"/>
+                <w:sz w:val="19"/>
               </w:rPr>
               <w:t xml:space="preserve">600 × 12 ÷ 60 = </w:t>
             </w:r>
             <w:r>
               <w:rPr>
                 <w:b/>
-                <w:sz w:val="18"/>
+                <w:sz w:val="19"/>
               </w:rPr>
               <w:t>120 h</w:t>
             </w:r>
             <w:r>
               <w:rPr>
                 <w:b w:val="0"/>
-                <w:sz w:val="18"/>
+                <w:sz w:val="19"/>
               </w:rPr>
             </w:r>
           </w:p>
@@ -3867,7 +3925,7 @@
             <w:r>
               <w:rPr>
                 <w:b w:val="0"/>
-                <w:sz w:val="18"/>
+                <w:sz w:val="19"/>
               </w:rPr>
               <w:t>Pedidos con correcciones</w:t>
             </w:r>
@@ -3884,21 +3942,21 @@
             <w:r>
               <w:rPr>
                 <w:b w:val="0"/>
-                <w:sz w:val="18"/>
+                <w:sz w:val="19"/>
               </w:rPr>
               <w:t xml:space="preserve">60 de 600 = </w:t>
             </w:r>
             <w:r>
               <w:rPr>
                 <w:b/>
-                <w:sz w:val="18"/>
+                <w:sz w:val="19"/>
               </w:rPr>
               <w:t>10 %</w:t>
             </w:r>
             <w:r>
               <w:rPr>
                 <w:b w:val="0"/>
-                <w:sz w:val="18"/>
+                <w:sz w:val="19"/>
               </w:rPr>
             </w:r>
           </w:p>
@@ -3914,21 +3972,21 @@
             <w:r>
               <w:rPr>
                 <w:b w:val="0"/>
-                <w:sz w:val="18"/>
+                <w:sz w:val="19"/>
               </w:rPr>
               <w:t xml:space="preserve">Máximo 30 de 600 = </w:t>
             </w:r>
             <w:r>
               <w:rPr>
                 <w:b/>
-                <w:sz w:val="18"/>
+                <w:sz w:val="19"/>
               </w:rPr>
               <w:t>5 %</w:t>
             </w:r>
             <w:r>
               <w:rPr>
                 <w:b w:val="0"/>
-                <w:sz w:val="18"/>
+                <w:sz w:val="19"/>
               </w:rPr>
             </w:r>
           </w:p>
@@ -3949,7 +4007,7 @@
             <w:r>
               <w:rPr>
                 <w:b w:val="0"/>
-                <w:sz w:val="18"/>
+                <w:sz w:val="19"/>
               </w:rPr>
               <w:t>Pedidos validados dentro del plazo acordado</w:t>
             </w:r>
@@ -3966,21 +4024,21 @@
             <w:r>
               <w:rPr>
                 <w:b w:val="0"/>
-                <w:sz w:val="18"/>
+                <w:sz w:val="19"/>
               </w:rPr>
               <w:t xml:space="preserve">420 de 600 = </w:t>
             </w:r>
             <w:r>
               <w:rPr>
                 <w:b/>
-                <w:sz w:val="18"/>
+                <w:sz w:val="19"/>
               </w:rPr>
               <w:t>70 %</w:t>
             </w:r>
             <w:r>
               <w:rPr>
                 <w:b w:val="0"/>
-                <w:sz w:val="18"/>
+                <w:sz w:val="19"/>
               </w:rPr>
             </w:r>
           </w:p>
@@ -3996,21 +4054,21 @@
             <w:r>
               <w:rPr>
                 <w:b w:val="0"/>
-                <w:sz w:val="18"/>
+                <w:sz w:val="19"/>
               </w:rPr>
               <w:t xml:space="preserve">Al menos 540 de 600 = </w:t>
             </w:r>
             <w:r>
               <w:rPr>
                 <w:b/>
-                <w:sz w:val="18"/>
+                <w:sz w:val="19"/>
               </w:rPr>
               <w:t>90 %</w:t>
             </w:r>
             <w:r>
               <w:rPr>
                 <w:b w:val="0"/>
-                <w:sz w:val="18"/>
+                <w:sz w:val="19"/>
               </w:rPr>
             </w:r>
           </w:p>
@@ -4718,10 +4776,10 @@
     <w:qFormat/>
     <w:rsid w:val="00FC693F"/>
     <w:pPr>
-      <w:spacing w:after="140" w:line="254" w:lineRule="auto"/>
+      <w:spacing w:after="160" w:line="269" w:lineRule="auto"/>
     </w:pPr>
     <w:rPr>
-      <w:rFonts w:ascii="Arial" w:hAnsi="Arial"/>
+      <w:rFonts w:ascii="Inter" w:hAnsi="Inter"/>
       <w:color w:val="000000"/>
       <w:sz w:val="22"/>
     </w:rPr>
@@ -4781,15 +4839,15 @@
     <w:pPr>
       <w:keepNext/>
       <w:keepLines/>
-      <w:spacing w:before="480" w:after="0"/>
+      <w:spacing w:before="320" w:after="180"/>
       <w:outlineLvl w:val="0"/>
     </w:pPr>
     <w:rPr>
-      <w:rFonts w:asciiTheme="majorHAnsi" w:eastAsiaTheme="majorEastAsia" w:hAnsiTheme="majorHAnsi" w:cstheme="majorBidi" w:ascii="Arial" w:hAnsi="Arial"/>
-      <w:b/>
+      <w:rFonts w:cstheme="majorBidi" w:ascii="Inter" w:hAnsi="Inter"/>
+      <w:b w:val="0"/>
       <w:bCs/>
       <w:color w:val="000000"/>
-      <w:sz w:val="32"/>
+      <w:sz w:val="34"/>
       <w:szCs w:val="28"/>
     </w:rPr>
   </w:style>
@@ -4805,15 +4863,15 @@
     <w:pPr>
       <w:keepNext/>
       <w:keepLines/>
-      <w:spacing w:before="200" w:after="0"/>
+      <w:spacing w:before="200" w:after="160"/>
       <w:outlineLvl w:val="1"/>
     </w:pPr>
     <w:rPr>
-      <w:rFonts w:asciiTheme="majorHAnsi" w:eastAsiaTheme="majorEastAsia" w:hAnsiTheme="majorHAnsi" w:cstheme="majorBidi" w:ascii="Arial" w:hAnsi="Arial"/>
-      <w:b/>
+      <w:rFonts w:cstheme="majorBidi" w:ascii="Inter" w:hAnsi="Inter"/>
+      <w:b w:val="0"/>
       <w:bCs/>
       <w:color w:val="000000"/>
-      <w:sz w:val="26"/>
+      <w:sz w:val="28"/>
       <w:szCs w:val="26"/>
     </w:rPr>
   </w:style>
@@ -4833,7 +4891,7 @@
       <w:outlineLvl w:val="2"/>
     </w:pPr>
     <w:rPr>
-      <w:rFonts w:asciiTheme="majorHAnsi" w:eastAsiaTheme="majorEastAsia" w:hAnsiTheme="majorHAnsi" w:cstheme="majorBidi" w:ascii="Arial" w:hAnsi="Arial"/>
+      <w:rFonts w:cstheme="majorBidi" w:ascii="Inter" w:hAnsi="Inter"/>
       <w:b/>
       <w:bCs/>
       <w:color w:val="000000"/>
@@ -4856,7 +4914,7 @@
       <w:outlineLvl w:val="3"/>
     </w:pPr>
     <w:rPr>
-      <w:rFonts w:asciiTheme="majorHAnsi" w:eastAsiaTheme="majorEastAsia" w:hAnsiTheme="majorHAnsi" w:cstheme="majorBidi"/>
+      <w:rFonts w:cstheme="majorBidi"/>
       <w:b/>
       <w:bCs/>
       <w:i/>
@@ -4881,7 +4939,7 @@
       <w:outlineLvl w:val="4"/>
     </w:pPr>
     <w:rPr>
-      <w:rFonts w:asciiTheme="majorHAnsi" w:eastAsiaTheme="majorEastAsia" w:hAnsiTheme="majorHAnsi" w:cstheme="majorBidi"/>
+      <w:rFonts w:cstheme="majorBidi"/>
       <w:color w:val="243F60" w:themeColor="accent1" w:themeShade="7F"/>
     </w:rPr>
   </w:style>
@@ -4902,7 +4960,7 @@
       <w:outlineLvl w:val="5"/>
     </w:pPr>
     <w:rPr>
-      <w:rFonts w:asciiTheme="majorHAnsi" w:eastAsiaTheme="majorEastAsia" w:hAnsiTheme="majorHAnsi" w:cstheme="majorBidi"/>
+      <w:rFonts w:cstheme="majorBidi"/>
       <w:i/>
       <w:iCs/>
       <w:color w:val="243F60" w:themeColor="accent1" w:themeShade="7F"/>
@@ -4925,7 +4983,7 @@
       <w:outlineLvl w:val="6"/>
     </w:pPr>
     <w:rPr>
-      <w:rFonts w:asciiTheme="majorHAnsi" w:eastAsiaTheme="majorEastAsia" w:hAnsiTheme="majorHAnsi" w:cstheme="majorBidi"/>
+      <w:rFonts w:cstheme="majorBidi"/>
       <w:i/>
       <w:iCs/>
       <w:color w:val="404040" w:themeColor="text1" w:themeTint="BF"/>
@@ -4948,7 +5006,7 @@
       <w:outlineLvl w:val="7"/>
     </w:pPr>
     <w:rPr>
-      <w:rFonts w:asciiTheme="majorHAnsi" w:eastAsiaTheme="majorEastAsia" w:hAnsiTheme="majorHAnsi" w:cstheme="majorBidi"/>
+      <w:rFonts w:cstheme="majorBidi"/>
       <w:color w:val="4F81BD" w:themeColor="accent1"/>
       <w:sz w:val="20"/>
       <w:szCs w:val="20"/>
@@ -4971,7 +5029,7 @@
       <w:outlineLvl w:val="8"/>
     </w:pPr>
     <w:rPr>
-      <w:rFonts w:asciiTheme="majorHAnsi" w:eastAsiaTheme="majorEastAsia" w:hAnsiTheme="majorHAnsi" w:cstheme="majorBidi"/>
+      <w:rFonts w:cstheme="majorBidi"/>
       <w:i/>
       <w:iCs/>
       <w:color w:val="404040" w:themeColor="text1" w:themeTint="BF"/>
@@ -5022,7 +5080,7 @@
     <w:uiPriority w:val="9"/>
     <w:rsid w:val="00FC693F"/>
     <w:rPr>
-      <w:rFonts w:asciiTheme="majorHAnsi" w:eastAsiaTheme="majorEastAsia" w:hAnsiTheme="majorHAnsi" w:cstheme="majorBidi"/>
+      <w:rFonts w:cstheme="majorBidi"/>
       <w:b/>
       <w:bCs/>
       <w:color w:val="365F91" w:themeColor="accent1" w:themeShade="BF"/>
@@ -5037,7 +5095,7 @@
     <w:uiPriority w:val="9"/>
     <w:rsid w:val="00FC693F"/>
     <w:rPr>
-      <w:rFonts w:asciiTheme="majorHAnsi" w:eastAsiaTheme="majorEastAsia" w:hAnsiTheme="majorHAnsi" w:cstheme="majorBidi"/>
+      <w:rFonts w:cstheme="majorBidi"/>
       <w:b/>
       <w:bCs/>
       <w:color w:val="4F81BD" w:themeColor="accent1"/>
@@ -5052,7 +5110,7 @@
     <w:uiPriority w:val="9"/>
     <w:rsid w:val="00FC693F"/>
     <w:rPr>
-      <w:rFonts w:asciiTheme="majorHAnsi" w:eastAsiaTheme="majorEastAsia" w:hAnsiTheme="majorHAnsi" w:cstheme="majorBidi"/>
+      <w:rFonts w:cstheme="majorBidi"/>
       <w:b/>
       <w:bCs/>
       <w:color w:val="4F81BD" w:themeColor="accent1"/>
@@ -5071,7 +5129,8 @@
       <w:contextualSpacing/>
     </w:pPr>
     <w:rPr>
-      <w:rFonts w:asciiTheme="majorHAnsi" w:eastAsiaTheme="majorEastAsia" w:hAnsiTheme="majorHAnsi" w:cstheme="majorBidi" w:ascii="Arial" w:hAnsi="Arial"/>
+      <w:rFonts w:cstheme="majorBidi" w:ascii="Inter" w:hAnsi="Inter"/>
+      <w:b w:val="0"/>
       <w:color w:val="000000"/>
       <w:spacing w:val="5"/>
       <w:kern w:val="28"/>
@@ -5086,7 +5145,7 @@
     <w:uiPriority w:val="10"/>
     <w:rsid w:val="00FC693F"/>
     <w:rPr>
-      <w:rFonts w:asciiTheme="majorHAnsi" w:eastAsiaTheme="majorEastAsia" w:hAnsiTheme="majorHAnsi" w:cstheme="majorBidi"/>
+      <w:rFonts w:cstheme="majorBidi"/>
       <w:color w:val="17365D" w:themeColor="text2" w:themeShade="BF"/>
       <w:spacing w:val="5"/>
       <w:kern w:val="28"/>
@@ -5108,7 +5167,7 @@
       </w:numPr>
     </w:pPr>
     <w:rPr>
-      <w:rFonts w:asciiTheme="majorHAnsi" w:eastAsiaTheme="majorEastAsia" w:hAnsiTheme="majorHAnsi" w:cstheme="majorBidi"/>
+      <w:rFonts w:cstheme="majorBidi"/>
       <w:i/>
       <w:iCs/>
       <w:color w:val="4F81BD" w:themeColor="accent1"/>
@@ -5124,7 +5183,7 @@
     <w:uiPriority w:val="11"/>
     <w:rsid w:val="00FC693F"/>
     <w:rPr>
-      <w:rFonts w:asciiTheme="majorHAnsi" w:eastAsiaTheme="majorEastAsia" w:hAnsiTheme="majorHAnsi" w:cstheme="majorBidi"/>
+      <w:rFonts w:cstheme="majorBidi"/>
       <w:i/>
       <w:iCs/>
       <w:color w:val="4F81BD" w:themeColor="accent1"/>
@@ -5252,7 +5311,7 @@
       <w:contextualSpacing/>
     </w:pPr>
     <w:rPr>
-      <w:rFonts w:ascii="Arial" w:hAnsi="Arial"/>
+      <w:rFonts w:ascii="Inter" w:hAnsi="Inter"/>
       <w:color w:val="000000"/>
     </w:rPr>
   </w:style>
@@ -5426,7 +5485,7 @@
     <w:semiHidden/>
     <w:rsid w:val="00FC693F"/>
     <w:rPr>
-      <w:rFonts w:asciiTheme="majorHAnsi" w:eastAsiaTheme="majorEastAsia" w:hAnsiTheme="majorHAnsi" w:cstheme="majorBidi"/>
+      <w:rFonts w:cstheme="majorBidi"/>
       <w:b/>
       <w:bCs/>
       <w:i/>
@@ -5442,7 +5501,7 @@
     <w:semiHidden/>
     <w:rsid w:val="00FC693F"/>
     <w:rPr>
-      <w:rFonts w:asciiTheme="majorHAnsi" w:eastAsiaTheme="majorEastAsia" w:hAnsiTheme="majorHAnsi" w:cstheme="majorBidi"/>
+      <w:rFonts w:cstheme="majorBidi"/>
       <w:color w:val="243F60" w:themeColor="accent1" w:themeShade="7F"/>
     </w:rPr>
   </w:style>
@@ -5454,7 +5513,7 @@
     <w:semiHidden/>
     <w:rsid w:val="00FC693F"/>
     <w:rPr>
-      <w:rFonts w:asciiTheme="majorHAnsi" w:eastAsiaTheme="majorEastAsia" w:hAnsiTheme="majorHAnsi" w:cstheme="majorBidi"/>
+      <w:rFonts w:cstheme="majorBidi"/>
       <w:i/>
       <w:iCs/>
       <w:color w:val="243F60" w:themeColor="accent1" w:themeShade="7F"/>
@@ -5468,7 +5527,7 @@
     <w:semiHidden/>
     <w:rsid w:val="00FC693F"/>
     <w:rPr>
-      <w:rFonts w:asciiTheme="majorHAnsi" w:eastAsiaTheme="majorEastAsia" w:hAnsiTheme="majorHAnsi" w:cstheme="majorBidi"/>
+      <w:rFonts w:cstheme="majorBidi"/>
       <w:i/>
       <w:iCs/>
       <w:color w:val="404040" w:themeColor="text1" w:themeTint="BF"/>
@@ -5482,7 +5541,7 @@
     <w:semiHidden/>
     <w:rsid w:val="00FC693F"/>
     <w:rPr>
-      <w:rFonts w:asciiTheme="majorHAnsi" w:eastAsiaTheme="majorEastAsia" w:hAnsiTheme="majorHAnsi" w:cstheme="majorBidi"/>
+      <w:rFonts w:cstheme="majorBidi"/>
       <w:color w:val="4F81BD" w:themeColor="accent1"/>
       <w:sz w:val="20"/>
       <w:szCs w:val="20"/>
@@ -5496,7 +5555,7 @@
     <w:semiHidden/>
     <w:rsid w:val="00FC693F"/>
     <w:rPr>
-      <w:rFonts w:asciiTheme="majorHAnsi" w:eastAsiaTheme="majorEastAsia" w:hAnsiTheme="majorHAnsi" w:cstheme="majorBidi"/>
+      <w:rFonts w:cstheme="majorBidi"/>
       <w:i/>
       <w:iCs/>
       <w:color w:val="404040" w:themeColor="text1" w:themeTint="BF"/>
@@ -7082,7 +7141,7 @@
         <w:spacing w:before="0" w:after="0" w:line="240" w:lineRule="auto"/>
       </w:pPr>
       <w:rPr>
-        <w:rFonts w:asciiTheme="majorHAnsi" w:eastAsiaTheme="majorEastAsia" w:hAnsiTheme="majorHAnsi" w:cstheme="majorBidi"/>
+        <w:rFonts w:cstheme="majorBidi"/>
         <w:b/>
         <w:bCs/>
       </w:rPr>
@@ -7103,7 +7162,7 @@
         <w:spacing w:before="0" w:after="0" w:line="240" w:lineRule="auto"/>
       </w:pPr>
       <w:rPr>
-        <w:rFonts w:asciiTheme="majorHAnsi" w:eastAsiaTheme="majorEastAsia" w:hAnsiTheme="majorHAnsi" w:cstheme="majorBidi"/>
+        <w:rFonts w:cstheme="majorBidi"/>
         <w:b/>
         <w:bCs/>
       </w:rPr>
@@ -7121,14 +7180,14 @@
     </w:tblStylePr>
     <w:tblStylePr w:type="firstCol">
       <w:rPr>
-        <w:rFonts w:asciiTheme="majorHAnsi" w:eastAsiaTheme="majorEastAsia" w:hAnsiTheme="majorHAnsi" w:cstheme="majorBidi"/>
+        <w:rFonts w:cstheme="majorBidi"/>
         <w:b/>
         <w:bCs/>
       </w:rPr>
     </w:tblStylePr>
     <w:tblStylePr w:type="lastCol">
       <w:rPr>
-        <w:rFonts w:asciiTheme="majorHAnsi" w:eastAsiaTheme="majorEastAsia" w:hAnsiTheme="majorHAnsi" w:cstheme="majorBidi"/>
+        <w:rFonts w:cstheme="majorBidi"/>
         <w:b/>
         <w:bCs/>
       </w:rPr>
@@ -7212,7 +7271,7 @@
         <w:spacing w:before="0" w:after="0" w:line="240" w:lineRule="auto"/>
       </w:pPr>
       <w:rPr>
-        <w:rFonts w:asciiTheme="majorHAnsi" w:eastAsiaTheme="majorEastAsia" w:hAnsiTheme="majorHAnsi" w:cstheme="majorBidi"/>
+        <w:rFonts w:cstheme="majorBidi"/>
         <w:b/>
         <w:bCs/>
       </w:rPr>
@@ -7233,7 +7292,7 @@
         <w:spacing w:before="0" w:after="0" w:line="240" w:lineRule="auto"/>
       </w:pPr>
       <w:rPr>
-        <w:rFonts w:asciiTheme="majorHAnsi" w:eastAsiaTheme="majorEastAsia" w:hAnsiTheme="majorHAnsi" w:cstheme="majorBidi"/>
+        <w:rFonts w:cstheme="majorBidi"/>
         <w:b/>
         <w:bCs/>
       </w:rPr>
@@ -7251,14 +7310,14 @@
     </w:tblStylePr>
     <w:tblStylePr w:type="firstCol">
       <w:rPr>
-        <w:rFonts w:asciiTheme="majorHAnsi" w:eastAsiaTheme="majorEastAsia" w:hAnsiTheme="majorHAnsi" w:cstheme="majorBidi"/>
+        <w:rFonts w:cstheme="majorBidi"/>
         <w:b/>
         <w:bCs/>
       </w:rPr>
     </w:tblStylePr>
     <w:tblStylePr w:type="lastCol">
       <w:rPr>
-        <w:rFonts w:asciiTheme="majorHAnsi" w:eastAsiaTheme="majorEastAsia" w:hAnsiTheme="majorHAnsi" w:cstheme="majorBidi"/>
+        <w:rFonts w:cstheme="majorBidi"/>
         <w:b/>
         <w:bCs/>
       </w:rPr>
@@ -7342,7 +7401,7 @@
         <w:spacing w:before="0" w:after="0" w:line="240" w:lineRule="auto"/>
       </w:pPr>
       <w:rPr>
-        <w:rFonts w:asciiTheme="majorHAnsi" w:eastAsiaTheme="majorEastAsia" w:hAnsiTheme="majorHAnsi" w:cstheme="majorBidi"/>
+        <w:rFonts w:cstheme="majorBidi"/>
         <w:b/>
         <w:bCs/>
       </w:rPr>
@@ -7363,7 +7422,7 @@
         <w:spacing w:before="0" w:after="0" w:line="240" w:lineRule="auto"/>
       </w:pPr>
       <w:rPr>
-        <w:rFonts w:asciiTheme="majorHAnsi" w:eastAsiaTheme="majorEastAsia" w:hAnsiTheme="majorHAnsi" w:cstheme="majorBidi"/>
+        <w:rFonts w:cstheme="majorBidi"/>
         <w:b/>
         <w:bCs/>
       </w:rPr>
@@ -7381,14 +7440,14 @@
     </w:tblStylePr>
     <w:tblStylePr w:type="firstCol">
       <w:rPr>
-        <w:rFonts w:asciiTheme="majorHAnsi" w:eastAsiaTheme="majorEastAsia" w:hAnsiTheme="majorHAnsi" w:cstheme="majorBidi"/>
+        <w:rFonts w:cstheme="majorBidi"/>
         <w:b/>
         <w:bCs/>
       </w:rPr>
     </w:tblStylePr>
     <w:tblStylePr w:type="lastCol">
       <w:rPr>
-        <w:rFonts w:asciiTheme="majorHAnsi" w:eastAsiaTheme="majorEastAsia" w:hAnsiTheme="majorHAnsi" w:cstheme="majorBidi"/>
+        <w:rFonts w:cstheme="majorBidi"/>
         <w:b/>
         <w:bCs/>
       </w:rPr>
@@ -7472,7 +7531,7 @@
         <w:spacing w:before="0" w:after="0" w:line="240" w:lineRule="auto"/>
       </w:pPr>
       <w:rPr>
-        <w:rFonts w:asciiTheme="majorHAnsi" w:eastAsiaTheme="majorEastAsia" w:hAnsiTheme="majorHAnsi" w:cstheme="majorBidi"/>
+        <w:rFonts w:cstheme="majorBidi"/>
         <w:b/>
         <w:bCs/>
       </w:rPr>
@@ -7493,7 +7552,7 @@
         <w:spacing w:before="0" w:after="0" w:line="240" w:lineRule="auto"/>
       </w:pPr>
       <w:rPr>
-        <w:rFonts w:asciiTheme="majorHAnsi" w:eastAsiaTheme="majorEastAsia" w:hAnsiTheme="majorHAnsi" w:cstheme="majorBidi"/>
+        <w:rFonts w:cstheme="majorBidi"/>
         <w:b/>
         <w:bCs/>
       </w:rPr>
@@ -7511,14 +7570,14 @@
     </w:tblStylePr>
     <w:tblStylePr w:type="firstCol">
       <w:rPr>
-        <w:rFonts w:asciiTheme="majorHAnsi" w:eastAsiaTheme="majorEastAsia" w:hAnsiTheme="majorHAnsi" w:cstheme="majorBidi"/>
+        <w:rFonts w:cstheme="majorBidi"/>
         <w:b/>
         <w:bCs/>
       </w:rPr>
     </w:tblStylePr>
     <w:tblStylePr w:type="lastCol">
       <w:rPr>
-        <w:rFonts w:asciiTheme="majorHAnsi" w:eastAsiaTheme="majorEastAsia" w:hAnsiTheme="majorHAnsi" w:cstheme="majorBidi"/>
+        <w:rFonts w:cstheme="majorBidi"/>
         <w:b/>
         <w:bCs/>
       </w:rPr>
@@ -7602,7 +7661,7 @@
         <w:spacing w:before="0" w:after="0" w:line="240" w:lineRule="auto"/>
       </w:pPr>
       <w:rPr>
-        <w:rFonts w:asciiTheme="majorHAnsi" w:eastAsiaTheme="majorEastAsia" w:hAnsiTheme="majorHAnsi" w:cstheme="majorBidi"/>
+        <w:rFonts w:cstheme="majorBidi"/>
         <w:b/>
         <w:bCs/>
       </w:rPr>
@@ -7623,7 +7682,7 @@
         <w:spacing w:before="0" w:after="0" w:line="240" w:lineRule="auto"/>
       </w:pPr>
       <w:rPr>
-        <w:rFonts w:asciiTheme="majorHAnsi" w:eastAsiaTheme="majorEastAsia" w:hAnsiTheme="majorHAnsi" w:cstheme="majorBidi"/>
+        <w:rFonts w:cstheme="majorBidi"/>
         <w:b/>
         <w:bCs/>
       </w:rPr>
@@ -7641,14 +7700,14 @@
     </w:tblStylePr>
     <w:tblStylePr w:type="firstCol">
       <w:rPr>
-        <w:rFonts w:asciiTheme="majorHAnsi" w:eastAsiaTheme="majorEastAsia" w:hAnsiTheme="majorHAnsi" w:cstheme="majorBidi"/>
+        <w:rFonts w:cstheme="majorBidi"/>
         <w:b/>
         <w:bCs/>
       </w:rPr>
     </w:tblStylePr>
     <w:tblStylePr w:type="lastCol">
       <w:rPr>
-        <w:rFonts w:asciiTheme="majorHAnsi" w:eastAsiaTheme="majorEastAsia" w:hAnsiTheme="majorHAnsi" w:cstheme="majorBidi"/>
+        <w:rFonts w:cstheme="majorBidi"/>
         <w:b/>
         <w:bCs/>
       </w:rPr>
@@ -7732,7 +7791,7 @@
         <w:spacing w:before="0" w:after="0" w:line="240" w:lineRule="auto"/>
       </w:pPr>
       <w:rPr>
-        <w:rFonts w:asciiTheme="majorHAnsi" w:eastAsiaTheme="majorEastAsia" w:hAnsiTheme="majorHAnsi" w:cstheme="majorBidi"/>
+        <w:rFonts w:cstheme="majorBidi"/>
         <w:b/>
         <w:bCs/>
       </w:rPr>
@@ -7753,7 +7812,7 @@
         <w:spacing w:before="0" w:after="0" w:line="240" w:lineRule="auto"/>
       </w:pPr>
       <w:rPr>
-        <w:rFonts w:asciiTheme="majorHAnsi" w:eastAsiaTheme="majorEastAsia" w:hAnsiTheme="majorHAnsi" w:cstheme="majorBidi"/>
+        <w:rFonts w:cstheme="majorBidi"/>
         <w:b/>
         <w:bCs/>
       </w:rPr>
@@ -7771,14 +7830,14 @@
     </w:tblStylePr>
     <w:tblStylePr w:type="firstCol">
       <w:rPr>
-        <w:rFonts w:asciiTheme="majorHAnsi" w:eastAsiaTheme="majorEastAsia" w:hAnsiTheme="majorHAnsi" w:cstheme="majorBidi"/>
+        <w:rFonts w:cstheme="majorBidi"/>
         <w:b/>
         <w:bCs/>
       </w:rPr>
     </w:tblStylePr>
     <w:tblStylePr w:type="lastCol">
       <w:rPr>
-        <w:rFonts w:asciiTheme="majorHAnsi" w:eastAsiaTheme="majorEastAsia" w:hAnsiTheme="majorHAnsi" w:cstheme="majorBidi"/>
+        <w:rFonts w:cstheme="majorBidi"/>
         <w:b/>
         <w:bCs/>
       </w:rPr>
@@ -7862,7 +7921,7 @@
         <w:spacing w:before="0" w:after="0" w:line="240" w:lineRule="auto"/>
       </w:pPr>
       <w:rPr>
-        <w:rFonts w:asciiTheme="majorHAnsi" w:eastAsiaTheme="majorEastAsia" w:hAnsiTheme="majorHAnsi" w:cstheme="majorBidi"/>
+        <w:rFonts w:cstheme="majorBidi"/>
         <w:b/>
         <w:bCs/>
       </w:rPr>
@@ -7883,7 +7942,7 @@
         <w:spacing w:before="0" w:after="0" w:line="240" w:lineRule="auto"/>
       </w:pPr>
       <w:rPr>
-        <w:rFonts w:asciiTheme="majorHAnsi" w:eastAsiaTheme="majorEastAsia" w:hAnsiTheme="majorHAnsi" w:cstheme="majorBidi"/>
+        <w:rFonts w:cstheme="majorBidi"/>
         <w:b/>
         <w:bCs/>
       </w:rPr>
@@ -7901,14 +7960,14 @@
     </w:tblStylePr>
     <w:tblStylePr w:type="firstCol">
       <w:rPr>
-        <w:rFonts w:asciiTheme="majorHAnsi" w:eastAsiaTheme="majorEastAsia" w:hAnsiTheme="majorHAnsi" w:cstheme="majorBidi"/>
+        <w:rFonts w:cstheme="majorBidi"/>
         <w:b/>
         <w:bCs/>
       </w:rPr>
     </w:tblStylePr>
     <w:tblStylePr w:type="lastCol">
       <w:rPr>
-        <w:rFonts w:asciiTheme="majorHAnsi" w:eastAsiaTheme="majorEastAsia" w:hAnsiTheme="majorHAnsi" w:cstheme="majorBidi"/>
+        <w:rFonts w:cstheme="majorBidi"/>
         <w:b/>
         <w:bCs/>
       </w:rPr>
@@ -9773,7 +9832,7 @@
     </w:tblPr>
     <w:tblStylePr w:type="firstRow">
       <w:rPr>
-        <w:rFonts w:asciiTheme="majorHAnsi" w:eastAsiaTheme="majorEastAsia" w:hAnsiTheme="majorHAnsi" w:cstheme="majorBidi"/>
+        <w:rFonts w:cstheme="majorBidi"/>
       </w:rPr>
       <w:tblPr/>
       <w:tcPr>
@@ -9857,7 +9916,7 @@
     </w:tblPr>
     <w:tblStylePr w:type="firstRow">
       <w:rPr>
-        <w:rFonts w:asciiTheme="majorHAnsi" w:eastAsiaTheme="majorEastAsia" w:hAnsiTheme="majorHAnsi" w:cstheme="majorBidi"/>
+        <w:rFonts w:cstheme="majorBidi"/>
       </w:rPr>
       <w:tblPr/>
       <w:tcPr>
@@ -9941,7 +10000,7 @@
     </w:tblPr>
     <w:tblStylePr w:type="firstRow">
       <w:rPr>
-        <w:rFonts w:asciiTheme="majorHAnsi" w:eastAsiaTheme="majorEastAsia" w:hAnsiTheme="majorHAnsi" w:cstheme="majorBidi"/>
+        <w:rFonts w:cstheme="majorBidi"/>
       </w:rPr>
       <w:tblPr/>
       <w:tcPr>
@@ -10025,7 +10084,7 @@
     </w:tblPr>
     <w:tblStylePr w:type="firstRow">
       <w:rPr>
-        <w:rFonts w:asciiTheme="majorHAnsi" w:eastAsiaTheme="majorEastAsia" w:hAnsiTheme="majorHAnsi" w:cstheme="majorBidi"/>
+        <w:rFonts w:cstheme="majorBidi"/>
       </w:rPr>
       <w:tblPr/>
       <w:tcPr>
@@ -10109,7 +10168,7 @@
     </w:tblPr>
     <w:tblStylePr w:type="firstRow">
       <w:rPr>
-        <w:rFonts w:asciiTheme="majorHAnsi" w:eastAsiaTheme="majorEastAsia" w:hAnsiTheme="majorHAnsi" w:cstheme="majorBidi"/>
+        <w:rFonts w:cstheme="majorBidi"/>
       </w:rPr>
       <w:tblPr/>
       <w:tcPr>
@@ -10193,7 +10252,7 @@
     </w:tblPr>
     <w:tblStylePr w:type="firstRow">
       <w:rPr>
-        <w:rFonts w:asciiTheme="majorHAnsi" w:eastAsiaTheme="majorEastAsia" w:hAnsiTheme="majorHAnsi" w:cstheme="majorBidi"/>
+        <w:rFonts w:cstheme="majorBidi"/>
       </w:rPr>
       <w:tblPr/>
       <w:tcPr>
@@ -10277,7 +10336,7 @@
     </w:tblPr>
     <w:tblStylePr w:type="firstRow">
       <w:rPr>
-        <w:rFonts w:asciiTheme="majorHAnsi" w:eastAsiaTheme="majorEastAsia" w:hAnsiTheme="majorHAnsi" w:cstheme="majorBidi"/>
+        <w:rFonts w:cstheme="majorBidi"/>
       </w:rPr>
       <w:tblPr/>
       <w:tcPr>
@@ -10342,7 +10401,7 @@
       <w:spacing w:after="0" w:line="240" w:lineRule="auto"/>
     </w:pPr>
     <w:rPr>
-      <w:rFonts w:asciiTheme="majorHAnsi" w:eastAsiaTheme="majorEastAsia" w:hAnsiTheme="majorHAnsi" w:cstheme="majorBidi"/>
+      <w:rFonts w:cstheme="majorBidi"/>
       <w:color w:val="000000" w:themeColor="text1"/>
     </w:rPr>
     <w:tblPr>
@@ -10470,7 +10529,7 @@
       <w:spacing w:after="0" w:line="240" w:lineRule="auto"/>
     </w:pPr>
     <w:rPr>
-      <w:rFonts w:asciiTheme="majorHAnsi" w:eastAsiaTheme="majorEastAsia" w:hAnsiTheme="majorHAnsi" w:cstheme="majorBidi"/>
+      <w:rFonts w:cstheme="majorBidi"/>
       <w:color w:val="000000" w:themeColor="text1"/>
     </w:rPr>
     <w:tblPr>
@@ -10598,7 +10657,7 @@
       <w:spacing w:after="0" w:line="240" w:lineRule="auto"/>
     </w:pPr>
     <w:rPr>
-      <w:rFonts w:asciiTheme="majorHAnsi" w:eastAsiaTheme="majorEastAsia" w:hAnsiTheme="majorHAnsi" w:cstheme="majorBidi"/>
+      <w:rFonts w:cstheme="majorBidi"/>
       <w:color w:val="000000" w:themeColor="text1"/>
     </w:rPr>
     <w:tblPr>
@@ -10726,7 +10785,7 @@
       <w:spacing w:after="0" w:line="240" w:lineRule="auto"/>
     </w:pPr>
     <w:rPr>
-      <w:rFonts w:asciiTheme="majorHAnsi" w:eastAsiaTheme="majorEastAsia" w:hAnsiTheme="majorHAnsi" w:cstheme="majorBidi"/>
+      <w:rFonts w:cstheme="majorBidi"/>
       <w:color w:val="000000" w:themeColor="text1"/>
     </w:rPr>
     <w:tblPr>
@@ -10854,7 +10913,7 @@
       <w:spacing w:after="0" w:line="240" w:lineRule="auto"/>
     </w:pPr>
     <w:rPr>
-      <w:rFonts w:asciiTheme="majorHAnsi" w:eastAsiaTheme="majorEastAsia" w:hAnsiTheme="majorHAnsi" w:cstheme="majorBidi"/>
+      <w:rFonts w:cstheme="majorBidi"/>
       <w:color w:val="000000" w:themeColor="text1"/>
     </w:rPr>
     <w:tblPr>
@@ -10982,7 +11041,7 @@
       <w:spacing w:after="0" w:line="240" w:lineRule="auto"/>
     </w:pPr>
     <w:rPr>
-      <w:rFonts w:asciiTheme="majorHAnsi" w:eastAsiaTheme="majorEastAsia" w:hAnsiTheme="majorHAnsi" w:cstheme="majorBidi"/>
+      <w:rFonts w:cstheme="majorBidi"/>
       <w:color w:val="000000" w:themeColor="text1"/>
     </w:rPr>
     <w:tblPr>
@@ -11110,7 +11169,7 @@
       <w:spacing w:after="0" w:line="240" w:lineRule="auto"/>
     </w:pPr>
     <w:rPr>
-      <w:rFonts w:asciiTheme="majorHAnsi" w:eastAsiaTheme="majorEastAsia" w:hAnsiTheme="majorHAnsi" w:cstheme="majorBidi"/>
+      <w:rFonts w:cstheme="majorBidi"/>
       <w:color w:val="000000" w:themeColor="text1"/>
     </w:rPr>
     <w:tblPr>
@@ -11749,7 +11808,7 @@
       <w:spacing w:after="0" w:line="240" w:lineRule="auto"/>
     </w:pPr>
     <w:rPr>
-      <w:rFonts w:asciiTheme="majorHAnsi" w:eastAsiaTheme="majorEastAsia" w:hAnsiTheme="majorHAnsi" w:cstheme="majorBidi"/>
+      <w:rFonts w:cstheme="majorBidi"/>
       <w:color w:val="000000" w:themeColor="text1"/>
     </w:rPr>
     <w:tblPr>
@@ -11874,7 +11933,7 @@
       <w:spacing w:after="0" w:line="240" w:lineRule="auto"/>
     </w:pPr>
     <w:rPr>
-      <w:rFonts w:asciiTheme="majorHAnsi" w:eastAsiaTheme="majorEastAsia" w:hAnsiTheme="majorHAnsi" w:cstheme="majorBidi"/>
+      <w:rFonts w:cstheme="majorBidi"/>
       <w:color w:val="000000" w:themeColor="text1"/>
     </w:rPr>
     <w:tblPr>
@@ -11999,7 +12058,7 @@
       <w:spacing w:after="0" w:line="240" w:lineRule="auto"/>
     </w:pPr>
     <w:rPr>
-      <w:rFonts w:asciiTheme="majorHAnsi" w:eastAsiaTheme="majorEastAsia" w:hAnsiTheme="majorHAnsi" w:cstheme="majorBidi"/>
+      <w:rFonts w:cstheme="majorBidi"/>
       <w:color w:val="000000" w:themeColor="text1"/>
     </w:rPr>
     <w:tblPr>
@@ -12124,7 +12183,7 @@
       <w:spacing w:after="0" w:line="240" w:lineRule="auto"/>
     </w:pPr>
     <w:rPr>
-      <w:rFonts w:asciiTheme="majorHAnsi" w:eastAsiaTheme="majorEastAsia" w:hAnsiTheme="majorHAnsi" w:cstheme="majorBidi"/>
+      <w:rFonts w:cstheme="majorBidi"/>
       <w:color w:val="000000" w:themeColor="text1"/>
     </w:rPr>
     <w:tblPr>
@@ -12249,7 +12308,7 @@
       <w:spacing w:after="0" w:line="240" w:lineRule="auto"/>
     </w:pPr>
     <w:rPr>
-      <w:rFonts w:asciiTheme="majorHAnsi" w:eastAsiaTheme="majorEastAsia" w:hAnsiTheme="majorHAnsi" w:cstheme="majorBidi"/>
+      <w:rFonts w:cstheme="majorBidi"/>
       <w:color w:val="000000" w:themeColor="text1"/>
     </w:rPr>
     <w:tblPr>
@@ -12374,7 +12433,7 @@
       <w:spacing w:after="0" w:line="240" w:lineRule="auto"/>
     </w:pPr>
     <w:rPr>
-      <w:rFonts w:asciiTheme="majorHAnsi" w:eastAsiaTheme="majorEastAsia" w:hAnsiTheme="majorHAnsi" w:cstheme="majorBidi"/>
+      <w:rFonts w:cstheme="majorBidi"/>
       <w:color w:val="000000" w:themeColor="text1"/>
     </w:rPr>
     <w:tblPr>
@@ -12499,7 +12558,7 @@
       <w:spacing w:after="0" w:line="240" w:lineRule="auto"/>
     </w:pPr>
     <w:rPr>
-      <w:rFonts w:asciiTheme="majorHAnsi" w:eastAsiaTheme="majorEastAsia" w:hAnsiTheme="majorHAnsi" w:cstheme="majorBidi"/>
+      <w:rFonts w:cstheme="majorBidi"/>
       <w:color w:val="000000" w:themeColor="text1"/>
     </w:rPr>
     <w:tblPr>

</xml_diff>